<commit_message>
Update TeamCity test plan resources
</commit_message>
<xml_diff>
--- a/docs/Тест План по Автоматизации Тестирования - TeamCity.docx
+++ b/docs/Тест План по Автоматизации Тестирования - TeamCity.docx
@@ -15376,33 +15376,17 @@
         <w:ind/>
         <w:rPr/>
       </w:pPr>
-      <w:r/>
-      <w:bookmarkStart w:id="1013" w:name="toc_sec_13"/>
       <w:r>
-        <w:rPr>
-          <w:rFonts w:ascii="Calibri" w:hAnsi="Calibri" w:eastAsia="Calibri" w:cs="Calibri"/>
-          <w:b/>
-          <w:bCs/>
-          <w:color w:val="2e74b5"/>
-          <w:sz w:val="32"/>
-          <w:szCs w:val="32"/>
-          <w:rtl w:val="0"/>
-        </w:rPr>
-        <w:t xml:space="preserve">Необходимые ресурсы</w:t>
+        <w:t>Необходимые ресурсы</w:t>
       </w:r>
+    </w:p>
+    <w:p>
+      <w:pPr>
+        <w:spacing w:after="160"/>
+      </w:pPr>
       <w:r>
-        <w:rPr>
-          <w:rtl w:val="0"/>
-        </w:rPr>
+        <w:t>Для реализации MVP автоматизации внешние ресурсы не требуются. Все работы выполняются силами QA Automation Engineers: выбор TMS, описание тестовых сценариев, автоматизация API/UI проверок, настройка CI/CD, отчетности, quality gates и уведомлений.</w:t>
       </w:r>
-      <w:bookmarkEnd w:id="1013"/>
-      <w:r>
-        <w:rPr>
-          <w:lang w:val="en-US"/>
-        </w:rPr>
-        <w:t xml:space="preserve"> TODO</w:t>
-      </w:r>
-      <w:r/>
     </w:p>
     <w:tbl>
       <w:tblPr>
@@ -15427,8 +15411,8 @@
       </w:tblGrid>
       <w:tr>
         <w:trPr>
+          <w:tblHeader/>
           <w:cantSplit/>
-          <w:tblHeader/>
         </w:trPr>
         <w:tc>
           <w:tcPr>
@@ -15444,30 +15428,15 @@
           </w:tcPr>
           <w:p>
             <w:pPr>
-              <w:pBdr/>
-              <w:spacing w:after="0" w:line="252" w:lineRule="auto"/>
-              <w:ind/>
-              <w:rPr/>
+              <w:jc w:val="left"/>
             </w:pPr>
             <w:r>
               <w:rPr>
-                <w:rFonts w:ascii="Calibri" w:hAnsi="Calibri" w:eastAsia="Calibri" w:cs="Calibri"/>
-                <w:b/>
-                <w:bCs/>
-                <w:sz w:val="18"/>
-                <w:szCs w:val="19"/>
-                <w:rtl w:val="0"/>
-              </w:rPr>
-              <w:t xml:space="preserve">Задача</w:t>
-            </w:r>
-            <w:r>
-              <w:rPr>
-                <w:rFonts w:ascii="Calibri" w:hAnsi="Calibri"/>
                 <w:b/>
                 <w:sz w:val="18"/>
               </w:rPr>
-            </w:r>
-            <w:r/>
+              <w:t>Неделя / задача</w:t>
+            </w:r>
           </w:p>
         </w:tc>
         <w:tc>
@@ -15484,30 +15453,15 @@
           </w:tcPr>
           <w:p>
             <w:pPr>
-              <w:pBdr/>
-              <w:spacing w:after="0" w:line="252" w:lineRule="auto"/>
-              <w:ind/>
-              <w:rPr/>
+              <w:jc w:val="left"/>
             </w:pPr>
             <w:r>
               <w:rPr>
-                <w:rFonts w:ascii="Calibri" w:hAnsi="Calibri" w:eastAsia="Calibri" w:cs="Calibri"/>
-                <w:b/>
-                <w:bCs/>
-                <w:sz w:val="18"/>
-                <w:szCs w:val="19"/>
-                <w:rtl w:val="0"/>
-              </w:rPr>
-              <w:t xml:space="preserve">Ответственный</w:t>
-            </w:r>
-            <w:r>
-              <w:rPr>
-                <w:rFonts w:ascii="Calibri" w:hAnsi="Calibri"/>
                 <w:b/>
                 <w:sz w:val="18"/>
               </w:rPr>
-            </w:r>
-            <w:r/>
+              <w:t>Ответственный</w:t>
+            </w:r>
           </w:p>
         </w:tc>
         <w:tc>
@@ -15524,30 +15478,15 @@
           </w:tcPr>
           <w:p>
             <w:pPr>
-              <w:pBdr/>
-              <w:spacing w:after="0" w:line="252" w:lineRule="auto"/>
-              <w:ind/>
-              <w:rPr/>
+              <w:jc w:val="left"/>
             </w:pPr>
             <w:r>
               <w:rPr>
-                <w:rFonts w:ascii="Calibri" w:hAnsi="Calibri" w:eastAsia="Calibri" w:cs="Calibri"/>
-                <w:b/>
-                <w:bCs/>
-                <w:sz w:val="18"/>
-                <w:szCs w:val="19"/>
-                <w:rtl w:val="0"/>
-              </w:rPr>
-              <w:t xml:space="preserve">Ожидание / статус</w:t>
-            </w:r>
-            <w:r>
-              <w:rPr>
-                <w:rFonts w:ascii="Calibri" w:hAnsi="Calibri"/>
                 <w:b/>
                 <w:sz w:val="18"/>
               </w:rPr>
-            </w:r>
-            <w:r/>
+              <w:t>Ожидание / результат</w:t>
+            </w:r>
           </w:p>
         </w:tc>
       </w:tr>
@@ -15557,113 +15496,54 @@
         </w:trPr>
         <w:tc>
           <w:tcPr>
-            <w:shd w:val="clear" w:color="auto" w:fill="ffffff"/>
-            <w:tcBorders/>
-            <w:tcMar>
-              <w:left w:w="120" w:type="dxa"/>
-              <w:top w:w="80" w:type="dxa"/>
-              <w:right w:w="120" w:type="dxa"/>
-              <w:bottom w:w="80" w:type="dxa"/>
-            </w:tcMar>
+            <w:tcW w:type="dxa" w:w="3264"/>
             <w:vAlign w:val="center"/>
           </w:tcPr>
           <w:p>
             <w:pPr>
-              <w:pBdr/>
-              <w:spacing w:after="0" w:line="252" w:lineRule="auto"/>
-              <w:ind/>
-              <w:rPr/>
+              <w:spacing w:after="0" w:line="240" w:lineRule="auto"/>
             </w:pPr>
             <w:r>
               <w:rPr>
-                <w:rFonts w:ascii="Calibri" w:hAnsi="Calibri" w:eastAsia="Calibri" w:cs="Calibri"/>
-                <w:sz w:val="18"/>
-                <w:szCs w:val="19"/>
-                <w:rtl w:val="0"/>
-              </w:rPr>
-              <w:t xml:space="preserve">Настройка CI/CD</w:t>
-            </w:r>
-            <w:r>
-              <w:rPr>
-                <w:rFonts w:ascii="Calibri" w:hAnsi="Calibri"/>
-                <w:sz w:val="18"/>
-              </w:rPr>
-            </w:r>
-            <w:r/>
+                <w:b/>
+                <w:sz w:val="17"/>
+              </w:rPr>
+              <w:t>Неделя 1: выбор TMS и описание критичных тестовых сценариев</w:t>
+            </w:r>
           </w:p>
         </w:tc>
         <w:tc>
           <w:tcPr>
-            <w:shd w:val="clear" w:color="auto" w:fill="ffffff"/>
-            <w:tcBorders/>
-            <w:tcMar>
-              <w:left w:w="120" w:type="dxa"/>
-              <w:top w:w="80" w:type="dxa"/>
-              <w:right w:w="120" w:type="dxa"/>
-              <w:bottom w:w="80" w:type="dxa"/>
-            </w:tcMar>
+            <w:tcW w:type="dxa" w:w="3264"/>
             <w:vAlign w:val="center"/>
           </w:tcPr>
           <w:p>
             <w:pPr>
-              <w:pBdr/>
-              <w:spacing w:after="0" w:line="252" w:lineRule="auto"/>
-              <w:ind/>
-              <w:rPr/>
+              <w:spacing w:after="0" w:line="240" w:lineRule="auto"/>
             </w:pPr>
             <w:r>
               <w:rPr>
-                <w:rFonts w:ascii="Calibri" w:hAnsi="Calibri" w:eastAsia="Calibri" w:cs="Calibri"/>
-                <w:sz w:val="18"/>
-                <w:szCs w:val="19"/>
-                <w:rtl w:val="0"/>
-              </w:rPr>
-              <w:t xml:space="preserve">QA Automation Engineer / DevOps: нет информации по конкретному владельцу</w:t>
-            </w:r>
-            <w:r>
-              <w:rPr>
-                <w:rFonts w:ascii="Calibri" w:hAnsi="Calibri"/>
-                <w:sz w:val="18"/>
-              </w:rPr>
-            </w:r>
-            <w:r/>
+                <w:sz w:val="17"/>
+              </w:rPr>
+              <w:t>QA Automation Engineers</w:t>
+            </w:r>
           </w:p>
         </w:tc>
         <w:tc>
           <w:tcPr>
-            <w:shd w:val="clear" w:color="auto" w:fill="ffffff"/>
-            <w:tcBorders/>
-            <w:tcMar>
-              <w:left w:w="120" w:type="dxa"/>
-              <w:top w:w="80" w:type="dxa"/>
-              <w:right w:w="120" w:type="dxa"/>
-              <w:bottom w:w="80" w:type="dxa"/>
-            </w:tcMar>
+            <w:tcW w:type="dxa" w:w="3264"/>
             <w:vAlign w:val="center"/>
           </w:tcPr>
           <w:p>
             <w:pPr>
-              <w:pBdr/>
-              <w:spacing w:after="0" w:line="252" w:lineRule="auto"/>
-              <w:ind/>
-              <w:rPr/>
+              <w:spacing w:after="0" w:line="240" w:lineRule="auto"/>
             </w:pPr>
             <w:r>
               <w:rPr>
-                <w:rFonts w:ascii="Calibri" w:hAnsi="Calibri" w:eastAsia="Calibri" w:cs="Calibri"/>
-                <w:sz w:val="18"/>
-                <w:szCs w:val="19"/>
-                <w:rtl w:val="0"/>
-              </w:rPr>
-              <w:t xml:space="preserve">Готов pipeline для bootstrap, запуска suites, публикации результатов и артефактов.</w:t>
-            </w:r>
-            <w:r>
-              <w:rPr>
-                <w:rFonts w:ascii="Calibri" w:hAnsi="Calibri"/>
-                <w:sz w:val="18"/>
-              </w:rPr>
-            </w:r>
-            <w:r/>
+                <w:sz w:val="17"/>
+              </w:rPr>
+              <w:t>Выбрана TMS для хранения тест-кейсов. Описаны критичные P0/P1 сценарии TeamCity: first start, создание администратора, роли и права доступа, agent authorization, project, build configuration, build run, build result. Для каждого сценария указаны шаги, expected result, приоритет и уровень автоматизации: API, UI или E2E.</w:t>
+            </w:r>
           </w:p>
         </w:tc>
       </w:tr>
@@ -15673,113 +15553,54 @@
         </w:trPr>
         <w:tc>
           <w:tcPr>
-            <w:shd w:val="clear" w:color="auto" w:fill="ffffff"/>
-            <w:tcBorders/>
-            <w:tcMar>
-              <w:left w:w="120" w:type="dxa"/>
-              <w:top w:w="80" w:type="dxa"/>
-              <w:right w:w="120" w:type="dxa"/>
-              <w:bottom w:w="80" w:type="dxa"/>
-            </w:tcMar>
+            <w:tcW w:type="dxa" w:w="3264"/>
             <w:vAlign w:val="center"/>
           </w:tcPr>
           <w:p>
             <w:pPr>
-              <w:pBdr/>
-              <w:spacing w:after="0" w:line="252" w:lineRule="auto"/>
-              <w:ind/>
-              <w:rPr/>
+              <w:spacing w:after="0" w:line="240" w:lineRule="auto"/>
             </w:pPr>
             <w:r>
               <w:rPr>
-                <w:rFonts w:ascii="Calibri" w:hAnsi="Calibri" w:eastAsia="Calibri" w:cs="Calibri"/>
-                <w:sz w:val="18"/>
-                <w:szCs w:val="19"/>
-                <w:rtl w:val="0"/>
-              </w:rPr>
-              <w:t xml:space="preserve">Документирование тест-кейсов</w:t>
-            </w:r>
-            <w:r>
-              <w:rPr>
-                <w:rFonts w:ascii="Calibri" w:hAnsi="Calibri"/>
-                <w:sz w:val="18"/>
-              </w:rPr>
-            </w:r>
-            <w:r/>
+                <w:b/>
+                <w:sz w:val="17"/>
+              </w:rPr>
+              <w:t>Неделя 2: автоматизация API-сценариев</w:t>
+            </w:r>
           </w:p>
         </w:tc>
         <w:tc>
           <w:tcPr>
-            <w:shd w:val="clear" w:color="auto" w:fill="ffffff"/>
-            <w:tcBorders/>
-            <w:tcMar>
-              <w:left w:w="120" w:type="dxa"/>
-              <w:top w:w="80" w:type="dxa"/>
-              <w:right w:w="120" w:type="dxa"/>
-              <w:bottom w:w="80" w:type="dxa"/>
-            </w:tcMar>
+            <w:tcW w:type="dxa" w:w="3264"/>
             <w:vAlign w:val="center"/>
           </w:tcPr>
           <w:p>
             <w:pPr>
-              <w:pBdr/>
-              <w:spacing w:after="0" w:line="252" w:lineRule="auto"/>
-              <w:ind/>
-              <w:rPr/>
+              <w:spacing w:after="0" w:line="240" w:lineRule="auto"/>
             </w:pPr>
             <w:r>
               <w:rPr>
-                <w:rFonts w:ascii="Calibri" w:hAnsi="Calibri" w:eastAsia="Calibri" w:cs="Calibri"/>
-                <w:sz w:val="18"/>
-                <w:szCs w:val="19"/>
-                <w:rtl w:val="0"/>
-              </w:rPr>
-              <w:t xml:space="preserve">QA Automation Engineers</w:t>
-            </w:r>
-            <w:r>
-              <w:rPr>
-                <w:rFonts w:ascii="Calibri" w:hAnsi="Calibri"/>
-                <w:sz w:val="18"/>
-              </w:rPr>
-            </w:r>
-            <w:r/>
+                <w:sz w:val="17"/>
+              </w:rPr>
+              <w:t>QA Automation Engineers</w:t>
+            </w:r>
           </w:p>
         </w:tc>
         <w:tc>
           <w:tcPr>
-            <w:shd w:val="clear" w:color="auto" w:fill="ffffff"/>
-            <w:tcBorders/>
-            <w:tcMar>
-              <w:left w:w="120" w:type="dxa"/>
-              <w:top w:w="80" w:type="dxa"/>
-              <w:right w:w="120" w:type="dxa"/>
-              <w:bottom w:w="80" w:type="dxa"/>
-            </w:tcMar>
+            <w:tcW w:type="dxa" w:w="3264"/>
             <w:vAlign w:val="center"/>
           </w:tcPr>
           <w:p>
             <w:pPr>
-              <w:pBdr/>
-              <w:spacing w:after="0" w:line="252" w:lineRule="auto"/>
-              <w:ind/>
-              <w:rPr/>
+              <w:spacing w:after="0" w:line="240" w:lineRule="auto"/>
             </w:pPr>
             <w:r>
               <w:rPr>
-                <w:rFonts w:ascii="Calibri" w:hAnsi="Calibri" w:eastAsia="Calibri" w:cs="Calibri"/>
-                <w:sz w:val="18"/>
-                <w:szCs w:val="19"/>
-                <w:rtl w:val="0"/>
-              </w:rPr>
-              <w:t xml:space="preserve">P0/P1 сценарии расписаны до автоматизации; TMS не выбрана.</w:t>
-            </w:r>
-            <w:r>
-              <w:rPr>
-                <w:rFonts w:ascii="Calibri" w:hAnsi="Calibri"/>
-                <w:sz w:val="18"/>
-              </w:rPr>
-            </w:r>
-            <w:r/>
+                <w:sz w:val="17"/>
+              </w:rPr>
+              <w:t>Реализованы базовые API автотесты для Core REST API: readiness/server info, создание project, создание build configuration, запуск build, получение build status, negative checks для авторизации и прав доступа. Подготовлены API-клиенты, fixtures, генерация уникальных тестовых данных и cleanup.</w:t>
+            </w:r>
           </w:p>
         </w:tc>
       </w:tr>
@@ -15789,113 +15610,54 @@
         </w:trPr>
         <w:tc>
           <w:tcPr>
-            <w:shd w:val="clear" w:color="auto" w:fill="ffffff"/>
-            <w:tcBorders/>
-            <w:tcMar>
-              <w:left w:w="120" w:type="dxa"/>
-              <w:top w:w="80" w:type="dxa"/>
-              <w:right w:w="120" w:type="dxa"/>
-              <w:bottom w:w="80" w:type="dxa"/>
-            </w:tcMar>
+            <w:tcW w:type="dxa" w:w="3264"/>
             <w:vAlign w:val="center"/>
           </w:tcPr>
           <w:p>
             <w:pPr>
-              <w:pBdr/>
-              <w:spacing w:after="0" w:line="252" w:lineRule="auto"/>
-              <w:ind/>
-              <w:rPr/>
+              <w:spacing w:after="0" w:line="240" w:lineRule="auto"/>
             </w:pPr>
             <w:r>
               <w:rPr>
-                <w:rFonts w:ascii="Calibri" w:hAnsi="Calibri" w:eastAsia="Calibri" w:cs="Calibri"/>
-                <w:sz w:val="18"/>
-                <w:szCs w:val="19"/>
-                <w:rtl w:val="0"/>
-              </w:rPr>
-              <w:t xml:space="preserve">Создание framework автоматизации</w:t>
-            </w:r>
-            <w:r>
-              <w:rPr>
-                <w:rFonts w:ascii="Calibri" w:hAnsi="Calibri"/>
-                <w:sz w:val="18"/>
-              </w:rPr>
-            </w:r>
-            <w:r/>
+                <w:b/>
+                <w:sz w:val="17"/>
+              </w:rPr>
+              <w:t>Неделя 3: автоматизация UI-сценариев</w:t>
+            </w:r>
           </w:p>
         </w:tc>
         <w:tc>
           <w:tcPr>
-            <w:shd w:val="clear" w:color="auto" w:fill="ffffff"/>
-            <w:tcBorders/>
-            <w:tcMar>
-              <w:left w:w="120" w:type="dxa"/>
-              <w:top w:w="80" w:type="dxa"/>
-              <w:right w:w="120" w:type="dxa"/>
-              <w:bottom w:w="80" w:type="dxa"/>
-            </w:tcMar>
+            <w:tcW w:type="dxa" w:w="3264"/>
             <w:vAlign w:val="center"/>
           </w:tcPr>
           <w:p>
             <w:pPr>
-              <w:pBdr/>
-              <w:spacing w:after="0" w:line="252" w:lineRule="auto"/>
-              <w:ind/>
-              <w:rPr/>
+              <w:spacing w:after="0" w:line="240" w:lineRule="auto"/>
             </w:pPr>
             <w:r>
               <w:rPr>
-                <w:rFonts w:ascii="Calibri" w:hAnsi="Calibri" w:eastAsia="Calibri" w:cs="Calibri"/>
-                <w:sz w:val="18"/>
-                <w:szCs w:val="19"/>
-                <w:rtl w:val="0"/>
-              </w:rPr>
-              <w:t xml:space="preserve">QA Automation Engineers</w:t>
-            </w:r>
-            <w:r>
-              <w:rPr>
-                <w:rFonts w:ascii="Calibri" w:hAnsi="Calibri"/>
-                <w:sz w:val="18"/>
-              </w:rPr>
-            </w:r>
-            <w:r/>
+                <w:sz w:val="17"/>
+              </w:rPr>
+              <w:t>QA Automation Engineers</w:t>
+            </w:r>
           </w:p>
         </w:tc>
         <w:tc>
           <w:tcPr>
-            <w:shd w:val="clear" w:color="auto" w:fill="ffffff"/>
-            <w:tcBorders/>
-            <w:tcMar>
-              <w:left w:w="120" w:type="dxa"/>
-              <w:top w:w="80" w:type="dxa"/>
-              <w:right w:w="120" w:type="dxa"/>
-              <w:bottom w:w="80" w:type="dxa"/>
-            </w:tcMar>
+            <w:tcW w:type="dxa" w:w="3264"/>
             <w:vAlign w:val="center"/>
           </w:tcPr>
           <w:p>
             <w:pPr>
-              <w:pBdr/>
-              <w:spacing w:after="0" w:line="252" w:lineRule="auto"/>
-              <w:ind/>
-              <w:rPr/>
+              <w:spacing w:after="0" w:line="240" w:lineRule="auto"/>
             </w:pPr>
             <w:r>
               <w:rPr>
-                <w:rFonts w:ascii="Calibri" w:hAnsi="Calibri" w:eastAsia="Calibri" w:cs="Calibri"/>
-                <w:sz w:val="18"/>
-                <w:szCs w:val="19"/>
-                <w:rtl w:val="0"/>
-              </w:rPr>
-              <w:t xml:space="preserve">Единая структура Pytest/Playwright, фикстуры, cleanup, логирование, отчетность.</w:t>
-            </w:r>
-            <w:r>
-              <w:rPr>
-                <w:rFonts w:ascii="Calibri" w:hAnsi="Calibri"/>
-                <w:sz w:val="18"/>
-              </w:rPr>
-            </w:r>
-            <w:r/>
+                <w:sz w:val="17"/>
+              </w:rPr>
+              <w:t>Реализованы UI автотесты только для критичных пользовательских flows, которые нельзя надежно заменить API: startup confirmation, database setup, создание первого администратора, login, authorization agent. Для UI-тестов настроены стабильные локаторы, ожидания, screenshots/video/trace для разбора падений.</w:t>
+            </w:r>
           </w:p>
         </w:tc>
       </w:tr>
@@ -15905,330 +15667,54 @@
         </w:trPr>
         <w:tc>
           <w:tcPr>
-            <w:shd w:val="clear" w:color="auto" w:fill="ffffff"/>
-            <w:tcBorders/>
-            <w:tcMar>
-              <w:left w:w="120" w:type="dxa"/>
-              <w:top w:w="80" w:type="dxa"/>
-              <w:right w:w="120" w:type="dxa"/>
-              <w:bottom w:w="80" w:type="dxa"/>
-            </w:tcMar>
+            <w:tcW w:type="dxa" w:w="3264"/>
             <w:vAlign w:val="center"/>
           </w:tcPr>
           <w:p>
             <w:pPr>
-              <w:pBdr/>
-              <w:spacing w:after="0" w:line="252" w:lineRule="auto"/>
-              <w:ind/>
-              <w:rPr/>
+              <w:spacing w:after="0" w:line="240" w:lineRule="auto"/>
             </w:pPr>
             <w:r>
               <w:rPr>
-                <w:rFonts w:ascii="Calibri" w:hAnsi="Calibri" w:eastAsia="Calibri" w:cs="Calibri"/>
-                <w:sz w:val="18"/>
-                <w:szCs w:val="19"/>
-                <w:rtl w:val="0"/>
-              </w:rPr>
-              <w:t xml:space="preserve">Доступы и credentials</w:t>
-            </w:r>
-            <w:r>
-              <w:rPr>
-                <w:rFonts w:ascii="Calibri" w:hAnsi="Calibri"/>
-                <w:sz w:val="18"/>
-              </w:rPr>
-            </w:r>
-            <w:r/>
+                <w:b/>
+                <w:sz w:val="17"/>
+              </w:rPr>
+              <w:t>Неделя 4: настройка CI/CD, отчетности и quality gates</w:t>
+            </w:r>
           </w:p>
         </w:tc>
         <w:tc>
           <w:tcPr>
-            <w:shd w:val="clear" w:color="auto" w:fill="ffffff"/>
-            <w:tcBorders/>
-            <w:tcMar>
-              <w:left w:w="120" w:type="dxa"/>
-              <w:top w:w="80" w:type="dxa"/>
-              <w:right w:w="120" w:type="dxa"/>
-              <w:bottom w:w="80" w:type="dxa"/>
-            </w:tcMar>
+            <w:tcW w:type="dxa" w:w="3264"/>
             <w:vAlign w:val="center"/>
           </w:tcPr>
           <w:p>
             <w:pPr>
-              <w:pBdr/>
-              <w:spacing w:after="0" w:line="252" w:lineRule="auto"/>
-              <w:ind/>
-              <w:rPr/>
+              <w:spacing w:after="0" w:line="240" w:lineRule="auto"/>
             </w:pPr>
             <w:r>
               <w:rPr>
-                <w:rFonts w:ascii="Calibri" w:hAnsi="Calibri" w:eastAsia="Calibri" w:cs="Calibri"/>
-                <w:sz w:val="18"/>
-                <w:szCs w:val="19"/>
-                <w:rtl w:val="0"/>
-              </w:rPr>
-              <w:t xml:space="preserve">Нет информации</w:t>
-            </w:r>
-            <w:r>
-              <w:rPr>
-                <w:rFonts w:ascii="Calibri" w:hAnsi="Calibri"/>
-                <w:sz w:val="18"/>
-              </w:rPr>
-            </w:r>
-            <w:r/>
+                <w:sz w:val="17"/>
+              </w:rPr>
+              <w:t>QA Automation Engineers</w:t>
+            </w:r>
           </w:p>
         </w:tc>
         <w:tc>
           <w:tcPr>
-            <w:shd w:val="clear" w:color="auto" w:fill="ffffff"/>
-            <w:tcBorders/>
-            <w:tcMar>
-              <w:left w:w="120" w:type="dxa"/>
-              <w:top w:w="80" w:type="dxa"/>
-              <w:right w:w="120" w:type="dxa"/>
-              <w:bottom w:w="80" w:type="dxa"/>
-            </w:tcMar>
+            <w:tcW w:type="dxa" w:w="3264"/>
             <w:vAlign w:val="center"/>
           </w:tcPr>
           <w:p>
             <w:pPr>
-              <w:pBdr/>
-              <w:spacing w:after="0" w:line="252" w:lineRule="auto"/>
-              <w:ind/>
-              <w:rPr/>
+              <w:spacing w:after="0" w:line="240" w:lineRule="auto"/>
             </w:pPr>
             <w:r>
               <w:rPr>
-                <w:rFonts w:ascii="Calibri" w:hAnsi="Calibri"/>
-                <w:b w:val="0"/>
-                <w:sz w:val="18"/>
-              </w:rPr>
-              <w:t xml:space="preserve">Нужны временные credentials/token для admin и ограниченных test users через переменные окружения CI.</w:t>
-            </w:r>
-            <w:r/>
-          </w:p>
-        </w:tc>
-      </w:tr>
-      <w:tr>
-        <w:trPr>
-          <w:cantSplit/>
-        </w:trPr>
-        <w:tc>
-          <w:tcPr>
-            <w:shd w:val="clear" w:color="auto" w:fill="ffffff"/>
-            <w:tcBorders/>
-            <w:tcMar>
-              <w:left w:w="120" w:type="dxa"/>
-              <w:top w:w="80" w:type="dxa"/>
-              <w:right w:w="120" w:type="dxa"/>
-              <w:bottom w:w="80" w:type="dxa"/>
-            </w:tcMar>
-            <w:vAlign w:val="center"/>
-          </w:tcPr>
-          <w:p>
-            <w:pPr>
-              <w:pBdr/>
-              <w:spacing w:after="0" w:line="252" w:lineRule="auto"/>
-              <w:ind/>
-              <w:rPr/>
-            </w:pPr>
-            <w:r>
-              <w:rPr>
-                <w:rFonts w:ascii="Calibri" w:hAnsi="Calibri" w:eastAsia="Calibri" w:cs="Calibri"/>
-                <w:sz w:val="18"/>
-                <w:szCs w:val="19"/>
-                <w:rtl w:val="0"/>
-              </w:rPr>
-              <w:t xml:space="preserve">Настройка отчетности</w:t>
-            </w:r>
-            <w:r>
-              <w:rPr>
-                <w:rFonts w:ascii="Calibri" w:hAnsi="Calibri"/>
-                <w:sz w:val="18"/>
-              </w:rPr>
-            </w:r>
-            <w:r/>
-          </w:p>
-        </w:tc>
-        <w:tc>
-          <w:tcPr>
-            <w:shd w:val="clear" w:color="auto" w:fill="ffffff"/>
-            <w:tcBorders/>
-            <w:tcMar>
-              <w:left w:w="120" w:type="dxa"/>
-              <w:top w:w="80" w:type="dxa"/>
-              <w:right w:w="120" w:type="dxa"/>
-              <w:bottom w:w="80" w:type="dxa"/>
-            </w:tcMar>
-            <w:vAlign w:val="center"/>
-          </w:tcPr>
-          <w:p>
-            <w:pPr>
-              <w:pBdr/>
-              <w:spacing w:after="0" w:line="252" w:lineRule="auto"/>
-              <w:ind/>
-              <w:rPr/>
-            </w:pPr>
-            <w:r>
-              <w:rPr>
-                <w:rFonts w:ascii="Calibri" w:hAnsi="Calibri" w:eastAsia="Calibri" w:cs="Calibri"/>
-                <w:sz w:val="18"/>
-                <w:szCs w:val="19"/>
-                <w:rtl w:val="0"/>
-              </w:rPr>
-              <w:t xml:space="preserve">QA Automation Engineer</w:t>
-            </w:r>
-            <w:r>
-              <w:rPr>
-                <w:rFonts w:ascii="Calibri" w:hAnsi="Calibri"/>
-                <w:sz w:val="18"/>
-              </w:rPr>
-            </w:r>
-            <w:r/>
-          </w:p>
-        </w:tc>
-        <w:tc>
-          <w:tcPr>
-            <w:shd w:val="clear" w:color="auto" w:fill="ffffff"/>
-            <w:tcBorders/>
-            <w:tcMar>
-              <w:left w:w="120" w:type="dxa"/>
-              <w:top w:w="80" w:type="dxa"/>
-              <w:right w:w="120" w:type="dxa"/>
-              <w:bottom w:w="80" w:type="dxa"/>
-            </w:tcMar>
-            <w:vAlign w:val="center"/>
-          </w:tcPr>
-          <w:p>
-            <w:pPr>
-              <w:pBdr/>
-              <w:spacing w:after="0" w:line="252" w:lineRule="auto"/>
-              <w:ind/>
-              <w:rPr/>
-            </w:pPr>
-            <w:r>
-              <w:rPr>
-                <w:rFonts w:ascii="Calibri" w:hAnsi="Calibri" w:eastAsia="Calibri" w:cs="Calibri"/>
-                <w:sz w:val="18"/>
-                <w:szCs w:val="19"/>
-                <w:rtl w:val="0"/>
-              </w:rPr>
-              <w:t xml:space="preserve">Инструмент отчетности не выбран; минимум нужны pass/fail, duration, logs, UI screenshots.</w:t>
-            </w:r>
-            <w:r>
-              <w:rPr>
-                <w:rFonts w:ascii="Calibri" w:hAnsi="Calibri"/>
-                <w:sz w:val="18"/>
-              </w:rPr>
-            </w:r>
-            <w:r/>
-          </w:p>
-        </w:tc>
-      </w:tr>
-      <w:tr>
-        <w:trPr>
-          <w:cantSplit/>
-        </w:trPr>
-        <w:tc>
-          <w:tcPr>
-            <w:shd w:val="clear" w:color="auto" w:fill="ffffff"/>
-            <w:tcBorders/>
-            <w:tcMar>
-              <w:left w:w="120" w:type="dxa"/>
-              <w:top w:w="80" w:type="dxa"/>
-              <w:right w:w="120" w:type="dxa"/>
-              <w:bottom w:w="80" w:type="dxa"/>
-            </w:tcMar>
-            <w:vAlign w:val="center"/>
-          </w:tcPr>
-          <w:p>
-            <w:pPr>
-              <w:pBdr/>
-              <w:spacing w:after="0" w:line="252" w:lineRule="auto"/>
-              <w:ind/>
-              <w:rPr/>
-            </w:pPr>
-            <w:r>
-              <w:rPr>
-                <w:rFonts w:ascii="Calibri" w:hAnsi="Calibri" w:eastAsia="Calibri" w:cs="Calibri"/>
-                <w:sz w:val="18"/>
-                <w:szCs w:val="19"/>
-                <w:rtl w:val="0"/>
-              </w:rPr>
-              <w:t xml:space="preserve">Code Coverage / Quality Gate</w:t>
-            </w:r>
-            <w:r>
-              <w:rPr>
-                <w:rFonts w:ascii="Calibri" w:hAnsi="Calibri"/>
-                <w:sz w:val="18"/>
-              </w:rPr>
-            </w:r>
-            <w:r/>
-          </w:p>
-        </w:tc>
-        <w:tc>
-          <w:tcPr>
-            <w:shd w:val="clear" w:color="auto" w:fill="ffffff"/>
-            <w:tcBorders/>
-            <w:tcMar>
-              <w:left w:w="120" w:type="dxa"/>
-              <w:top w:w="80" w:type="dxa"/>
-              <w:right w:w="120" w:type="dxa"/>
-              <w:bottom w:w="80" w:type="dxa"/>
-            </w:tcMar>
-            <w:vAlign w:val="center"/>
-          </w:tcPr>
-          <w:p>
-            <w:pPr>
-              <w:pBdr/>
-              <w:spacing w:after="0" w:line="252" w:lineRule="auto"/>
-              <w:ind/>
-              <w:rPr/>
-            </w:pPr>
-            <w:r>
-              <w:rPr>
-                <w:rFonts w:ascii="Calibri" w:hAnsi="Calibri" w:eastAsia="Calibri" w:cs="Calibri"/>
-                <w:sz w:val="18"/>
-                <w:szCs w:val="19"/>
-                <w:rtl w:val="0"/>
-              </w:rPr>
-              <w:t xml:space="preserve">Нет информации</w:t>
-            </w:r>
-            <w:r>
-              <w:rPr>
-                <w:rFonts w:ascii="Calibri" w:hAnsi="Calibri"/>
-                <w:sz w:val="18"/>
-              </w:rPr>
-            </w:r>
-            <w:r/>
-          </w:p>
-        </w:tc>
-        <w:tc>
-          <w:tcPr>
-            <w:shd w:val="clear" w:color="auto" w:fill="ffffff"/>
-            <w:tcBorders/>
-            <w:tcMar>
-              <w:left w:w="120" w:type="dxa"/>
-              <w:top w:w="80" w:type="dxa"/>
-              <w:right w:w="120" w:type="dxa"/>
-              <w:bottom w:w="80" w:type="dxa"/>
-            </w:tcMar>
-            <w:vAlign w:val="center"/>
-          </w:tcPr>
-          <w:p>
-            <w:pPr>
-              <w:pBdr/>
-              <w:spacing w:after="0" w:line="252" w:lineRule="auto"/>
-              <w:ind/>
-              <w:rPr/>
-            </w:pPr>
-            <w:r>
-              <w:rPr>
-                <w:rFonts w:ascii="Calibri" w:hAnsi="Calibri"/>
-                <w:sz w:val="18"/>
-              </w:rPr>
-              <w:t xml:space="preserve">Unit tests существуют на стороне продукта, но исходный код и их coverage вне зоны проекта; для нашего black-box scope quality gate оценивается по P0/P1 UI/API/E2E pass rate.</w:t>
-            </w:r>
-            <w:r/>
+                <w:sz w:val="17"/>
+              </w:rPr>
+              <w:t>Настроен pipeline, который поднимает TeamCity стенд, выполняет bootstrap, запускает API/UI/E2E автотесты и публикует результаты. Подключен Allure Report с метриками pass rate, fail rate, duration, flaky failures, failed tests и skipped tests. Настроены quality gates автотестов: pipeline не считается успешным, если падают критичные P0/P1 проверки или pass rate ниже заданного порога. Добавлены уведомления в Telegram через bot: статус прогона, ссылка на отчет, passed/failed/skipped и список критичных падений.</w:t>
+            </w:r>
           </w:p>
         </w:tc>
       </w:tr>

</xml_diff>

<commit_message>
Update TeamCity phased automation plan
</commit_message>
<xml_diff>
--- a/docs/Тест План по Автоматизации Тестирования - TeamCity.docx
+++ b/docs/Тест План по Автоматизации Тестирования - TeamCity.docx
@@ -14732,33 +14732,17 @@
         <w:ind/>
         <w:rPr/>
       </w:pPr>
-      <w:r/>
-      <w:bookmarkStart w:id="1012" w:name="toc_sec_12"/>
       <w:r>
-        <w:rPr>
-          <w:rFonts w:ascii="Calibri" w:hAnsi="Calibri" w:eastAsia="Calibri" w:cs="Calibri"/>
-          <w:b/>
-          <w:bCs/>
-          <w:color w:val="2e74b5"/>
-          <w:sz w:val="32"/>
-          <w:szCs w:val="32"/>
-          <w:rtl w:val="0"/>
-        </w:rPr>
-        <w:t xml:space="preserve">Поэтапный план</w:t>
+        <w:t>Поэтапный план</w:t>
       </w:r>
+    </w:p>
+    <w:p>
+      <w:pPr>
+        <w:spacing w:after="160"/>
+      </w:pPr>
       <w:r>
-        <w:rPr>
-          <w:rtl w:val="0"/>
-        </w:rPr>
+        <w:t>Основные этапы внедрения MVP автоматизации рассчитаны на 4 недели. Для каждого этапа фиксируются цель, срок, ключевые шаги и ожидаемый результат. CI/CD развивается параллельно по мере появления API/UI тестов, но основной фокус на сборку пайплайна, отчетности и quality gates выносится на 4 неделю.</w:t>
       </w:r>
-      <w:bookmarkEnd w:id="1012"/>
-      <w:r>
-        <w:rPr>
-          <w:lang w:val="en-US"/>
-        </w:rPr>
-        <w:t xml:space="preserve"> TODO</w:t>
-      </w:r>
-      <w:r/>
     </w:p>
     <w:tbl>
       <w:tblPr>
@@ -14783,8 +14767,8 @@
       </w:tblGrid>
       <w:tr>
         <w:trPr>
+          <w:tblHeader/>
           <w:cantSplit/>
-          <w:tblHeader/>
         </w:trPr>
         <w:tc>
           <w:tcPr>
@@ -14800,30 +14784,15 @@
           </w:tcPr>
           <w:p>
             <w:pPr>
-              <w:pBdr/>
-              <w:spacing w:after="0" w:line="252" w:lineRule="auto"/>
-              <w:ind/>
-              <w:rPr/>
+              <w:jc w:val="left"/>
             </w:pPr>
             <w:r>
               <w:rPr>
-                <w:rFonts w:ascii="Calibri" w:hAnsi="Calibri" w:eastAsia="Calibri" w:cs="Calibri"/>
-                <w:b/>
-                <w:bCs/>
-                <w:sz w:val="18"/>
-                <w:szCs w:val="19"/>
-                <w:rtl w:val="0"/>
-              </w:rPr>
-              <w:t xml:space="preserve">Неделя</w:t>
-            </w:r>
-            <w:r>
-              <w:rPr>
-                <w:rFonts w:ascii="Calibri" w:hAnsi="Calibri"/>
                 <w:b/>
                 <w:sz w:val="18"/>
               </w:rPr>
-            </w:r>
-            <w:r/>
+              <w:t>Этап / срок</w:t>
+            </w:r>
           </w:p>
         </w:tc>
         <w:tc>
@@ -14840,30 +14809,15 @@
           </w:tcPr>
           <w:p>
             <w:pPr>
-              <w:pBdr/>
-              <w:spacing w:after="0" w:line="252" w:lineRule="auto"/>
-              <w:ind/>
-              <w:rPr/>
+              <w:jc w:val="left"/>
             </w:pPr>
             <w:r>
               <w:rPr>
-                <w:rFonts w:ascii="Calibri" w:hAnsi="Calibri" w:eastAsia="Calibri" w:cs="Calibri"/>
-                <w:b/>
-                <w:bCs/>
-                <w:sz w:val="18"/>
-                <w:szCs w:val="19"/>
-                <w:rtl w:val="0"/>
-              </w:rPr>
-              <w:t xml:space="preserve">Фокус</w:t>
-            </w:r>
-            <w:r>
-              <w:rPr>
-                <w:rFonts w:ascii="Calibri" w:hAnsi="Calibri"/>
                 <w:b/>
                 <w:sz w:val="18"/>
               </w:rPr>
-            </w:r>
-            <w:r/>
+              <w:t>Цель</w:t>
+            </w:r>
           </w:p>
         </w:tc>
         <w:tc>
@@ -14880,30 +14834,15 @@
           </w:tcPr>
           <w:p>
             <w:pPr>
-              <w:pBdr/>
-              <w:spacing w:after="0" w:line="252" w:lineRule="auto"/>
-              <w:ind/>
-              <w:rPr/>
+              <w:jc w:val="left"/>
             </w:pPr>
             <w:r>
               <w:rPr>
-                <w:rFonts w:ascii="Calibri" w:hAnsi="Calibri" w:eastAsia="Calibri" w:cs="Calibri"/>
-                <w:b/>
-                <w:bCs/>
-                <w:sz w:val="18"/>
-                <w:szCs w:val="19"/>
-                <w:rtl w:val="0"/>
-              </w:rPr>
-              <w:t xml:space="preserve">Результат</w:t>
-            </w:r>
-            <w:r>
-              <w:rPr>
-                <w:rFonts w:ascii="Calibri" w:hAnsi="Calibri"/>
                 <w:b/>
                 <w:sz w:val="18"/>
               </w:rPr>
-            </w:r>
-            <w:r/>
+              <w:t>Ключевые шаги и результат</w:t>
+            </w:r>
           </w:p>
         </w:tc>
       </w:tr>
@@ -14913,106 +14852,56 @@
         </w:trPr>
         <w:tc>
           <w:tcPr>
-            <w:shd w:val="clear" w:color="auto" w:fill="ffffff"/>
-            <w:tcBorders/>
-            <w:tcMar>
-              <w:left w:w="120" w:type="dxa"/>
-              <w:top w:w="80" w:type="dxa"/>
-              <w:right w:w="120" w:type="dxa"/>
-              <w:bottom w:w="80" w:type="dxa"/>
-            </w:tcMar>
+            <w:tcW w:type="dxa" w:w="3264"/>
             <w:vAlign w:val="center"/>
           </w:tcPr>
           <w:p>
             <w:pPr>
-              <w:pBdr/>
-              <w:spacing w:after="0" w:line="252" w:lineRule="auto"/>
-              <w:ind/>
-              <w:rPr/>
+              <w:spacing w:after="0" w:line="240" w:lineRule="auto"/>
             </w:pPr>
             <w:r>
               <w:rPr>
-                <w:rFonts w:ascii="Calibri" w:hAnsi="Calibri" w:eastAsia="Calibri" w:cs="Calibri"/>
-                <w:sz w:val="18"/>
-                <w:szCs w:val="19"/>
-                <w:rtl w:val="0"/>
-              </w:rPr>
-              <w:t xml:space="preserve">1</w:t>
-            </w:r>
-            <w:r>
-              <w:rPr>
-                <w:rFonts w:ascii="Calibri" w:hAnsi="Calibri"/>
-                <w:sz w:val="18"/>
-              </w:rPr>
-            </w:r>
-            <w:r/>
+                <w:b/>
+                <w:sz w:val="16"/>
+              </w:rPr>
+              <w:t>Этап 1: тест-дизайн и критичный scope</w:t>
+              <w:br/>
+              <w:t>Срок: 1 неделя (1-я неделя проекта)</w:t>
+            </w:r>
           </w:p>
         </w:tc>
         <w:tc>
           <w:tcPr>
-            <w:shd w:val="clear" w:color="auto" w:fill="ffffff"/>
-            <w:tcBorders/>
-            <w:tcMar>
-              <w:left w:w="120" w:type="dxa"/>
-              <w:top w:w="80" w:type="dxa"/>
-              <w:right w:w="120" w:type="dxa"/>
-              <w:bottom w:w="80" w:type="dxa"/>
-            </w:tcMar>
+            <w:tcW w:type="dxa" w:w="3264"/>
             <w:vAlign w:val="center"/>
           </w:tcPr>
           <w:p>
             <w:pPr>
-              <w:pBdr/>
-              <w:spacing w:after="0" w:line="252" w:lineRule="auto"/>
-              <w:ind/>
-              <w:rPr/>
+              <w:spacing w:after="0" w:line="240" w:lineRule="auto"/>
             </w:pPr>
             <w:r>
               <w:rPr>
-                <w:rFonts w:ascii="Calibri" w:hAnsi="Calibri" w:eastAsia="Calibri" w:cs="Calibri"/>
-                <w:sz w:val="18"/>
-                <w:szCs w:val="19"/>
-                <w:rtl w:val="0"/>
-              </w:rPr>
-              <w:t xml:space="preserve">Ручные сценарии, тест-дизайн, тестируемость</w:t>
-            </w:r>
-            <w:r>
-              <w:rPr>
-                <w:rFonts w:ascii="Calibri" w:hAnsi="Calibri"/>
-                <w:sz w:val="18"/>
-              </w:rPr>
-            </w:r>
-            <w:r/>
+                <w:sz w:val="16"/>
+              </w:rPr>
+              <w:t>Определить, какие критичные сценарии TeamCity входят в MVP автоматизации и как они будут проверяться: API, UI или E2E.</w:t>
+            </w:r>
           </w:p>
         </w:tc>
         <w:tc>
           <w:tcPr>
-            <w:shd w:val="clear" w:color="auto" w:fill="ffffff"/>
-            <w:tcBorders/>
-            <w:tcMar>
-              <w:left w:w="120" w:type="dxa"/>
-              <w:top w:w="80" w:type="dxa"/>
-              <w:right w:w="120" w:type="dxa"/>
-              <w:bottom w:w="80" w:type="dxa"/>
-            </w:tcMar>
+            <w:tcW w:type="dxa" w:w="3264"/>
             <w:vAlign w:val="center"/>
           </w:tcPr>
           <w:p>
             <w:pPr>
-              <w:pBdr/>
-              <w:spacing w:after="0" w:line="252" w:lineRule="auto"/>
-              <w:ind/>
-              <w:rPr/>
+              <w:spacing w:after="0" w:line="240" w:lineRule="auto"/>
             </w:pPr>
             <w:r>
               <w:rPr>
-                <w:rFonts w:ascii="Calibri" w:hAnsi="Calibri"/>
-                <w:b w:val="0"/>
-                <w:sz w:val="18"/>
-              </w:rPr>
-              <w:t xml:space="preserve">Описаны P0/P1 сценарии: setup, first admin, roles/permissions, agent, project, build configuration, build run, REST checks. Зафиксированы риски и TODO.</w:t>
-            </w:r>
-            <w:r/>
+                <w:sz w:val="16"/>
+              </w:rPr>
+              <w:t>Ключевые шаги: выбрать TMS; описать ручные тест-кейсы для P0/P1 сценариев; определить scope критичной функциональности; разделить проверки на API/UI/E2E; зафиксировать expected results, тестовые данные и риски. Результат: готов утвержденный MVP-scope и набор критичных тест-кейсов для автоматизации.</w:t>
+            </w:r>
           </w:p>
         </w:tc>
       </w:tr>
@@ -15022,106 +14911,56 @@
         </w:trPr>
         <w:tc>
           <w:tcPr>
-            <w:shd w:val="clear" w:color="auto" w:fill="ffffff"/>
-            <w:tcBorders/>
-            <w:tcMar>
-              <w:left w:w="120" w:type="dxa"/>
-              <w:top w:w="80" w:type="dxa"/>
-              <w:right w:w="120" w:type="dxa"/>
-              <w:bottom w:w="80" w:type="dxa"/>
-            </w:tcMar>
+            <w:tcW w:type="dxa" w:w="3264"/>
             <w:vAlign w:val="center"/>
           </w:tcPr>
           <w:p>
             <w:pPr>
-              <w:pBdr/>
-              <w:spacing w:after="0" w:line="252" w:lineRule="auto"/>
-              <w:ind/>
-              <w:rPr/>
+              <w:spacing w:after="0" w:line="240" w:lineRule="auto"/>
             </w:pPr>
             <w:r>
               <w:rPr>
-                <w:rFonts w:ascii="Calibri" w:hAnsi="Calibri" w:eastAsia="Calibri" w:cs="Calibri"/>
-                <w:sz w:val="18"/>
-                <w:szCs w:val="19"/>
-                <w:rtl w:val="0"/>
-              </w:rPr>
-              <w:t xml:space="preserve">2</w:t>
-            </w:r>
-            <w:r>
-              <w:rPr>
-                <w:rFonts w:ascii="Calibri" w:hAnsi="Calibri"/>
-                <w:sz w:val="18"/>
-              </w:rPr>
-            </w:r>
-            <w:r/>
+                <w:b/>
+                <w:sz w:val="16"/>
+              </w:rPr>
+              <w:t>Этап 2: базовый фреймворк и API автотесты</w:t>
+              <w:br/>
+              <w:t>Срок: 1 неделя (2-я неделя проекта)</w:t>
+            </w:r>
           </w:p>
         </w:tc>
         <w:tc>
           <w:tcPr>
-            <w:shd w:val="clear" w:color="auto" w:fill="ffffff"/>
-            <w:tcBorders/>
-            <w:tcMar>
-              <w:left w:w="120" w:type="dxa"/>
-              <w:top w:w="80" w:type="dxa"/>
-              <w:right w:w="120" w:type="dxa"/>
-              <w:bottom w:w="80" w:type="dxa"/>
-            </w:tcMar>
+            <w:tcW w:type="dxa" w:w="3264"/>
             <w:vAlign w:val="center"/>
           </w:tcPr>
           <w:p>
             <w:pPr>
-              <w:pBdr/>
-              <w:spacing w:after="0" w:line="252" w:lineRule="auto"/>
-              <w:ind/>
-              <w:rPr/>
+              <w:spacing w:after="0" w:line="240" w:lineRule="auto"/>
             </w:pPr>
             <w:r>
               <w:rPr>
-                <w:rFonts w:ascii="Calibri" w:hAnsi="Calibri" w:eastAsia="Calibri" w:cs="Calibri"/>
-                <w:sz w:val="18"/>
-                <w:szCs w:val="19"/>
-                <w:rtl w:val="0"/>
-              </w:rPr>
-              <w:t xml:space="preserve">UI автотесты + базовый framework</w:t>
-            </w:r>
-            <w:r>
-              <w:rPr>
-                <w:rFonts w:ascii="Calibri" w:hAnsi="Calibri"/>
-                <w:sz w:val="18"/>
-              </w:rPr>
-            </w:r>
-            <w:r/>
+                <w:sz w:val="16"/>
+              </w:rPr>
+              <w:t>Построить основу фреймворка и закрыть быстрым стабильным покрытием критичные REST API сценарии.</w:t>
+            </w:r>
           </w:p>
         </w:tc>
         <w:tc>
           <w:tcPr>
-            <w:shd w:val="clear" w:color="auto" w:fill="ffffff"/>
-            <w:tcBorders/>
-            <w:tcMar>
-              <w:left w:w="120" w:type="dxa"/>
-              <w:top w:w="80" w:type="dxa"/>
-              <w:right w:w="120" w:type="dxa"/>
-              <w:bottom w:w="80" w:type="dxa"/>
-            </w:tcMar>
+            <w:tcW w:type="dxa" w:w="3264"/>
             <w:vAlign w:val="center"/>
           </w:tcPr>
           <w:p>
             <w:pPr>
-              <w:pBdr/>
-              <w:spacing w:after="0" w:line="252" w:lineRule="auto"/>
-              <w:ind/>
-              <w:rPr/>
+              <w:spacing w:after="0" w:line="240" w:lineRule="auto"/>
             </w:pPr>
             <w:r>
               <w:rPr>
-                <w:rFonts w:ascii="Calibri" w:hAnsi="Calibri"/>
-                <w:b w:val="0"/>
-                <w:sz w:val="18"/>
-              </w:rPr>
-              <w:t xml:space="preserve">Автоматизирован критичный UI flow: startup confirmation, database selection, first admin, login, agent authorization, базовые role-based UI checks.</w:t>
-            </w:r>
-            <w:r/>
+                <w:sz w:val="16"/>
+              </w:rPr>
+              <w:t>Ключевые шаги: создать структуру Python/Pytest framework; настроить конфигурацию, fixtures, API clients, генерацию уникальных данных, cleanup и базовое логирование; реализовать API тесты для readiness/server info, project, build configuration, build run, build status, authorization/permissions negative checks; начать базовую интеграцию с CI. Результат: API suite запускается локально и готов к включению в pipeline.</w:t>
+            </w:r>
           </w:p>
         </w:tc>
       </w:tr>
@@ -15131,106 +14970,56 @@
         </w:trPr>
         <w:tc>
           <w:tcPr>
-            <w:shd w:val="clear" w:color="auto" w:fill="ffffff"/>
-            <w:tcBorders/>
-            <w:tcMar>
-              <w:left w:w="120" w:type="dxa"/>
-              <w:top w:w="80" w:type="dxa"/>
-              <w:right w:w="120" w:type="dxa"/>
-              <w:bottom w:w="80" w:type="dxa"/>
-            </w:tcMar>
+            <w:tcW w:type="dxa" w:w="3264"/>
             <w:vAlign w:val="center"/>
           </w:tcPr>
           <w:p>
             <w:pPr>
-              <w:pBdr/>
-              <w:spacing w:after="0" w:line="252" w:lineRule="auto"/>
-              <w:ind/>
-              <w:rPr/>
+              <w:spacing w:after="0" w:line="240" w:lineRule="auto"/>
             </w:pPr>
             <w:r>
               <w:rPr>
-                <w:rFonts w:ascii="Calibri" w:hAnsi="Calibri" w:eastAsia="Calibri" w:cs="Calibri"/>
-                <w:sz w:val="18"/>
-                <w:szCs w:val="19"/>
-                <w:rtl w:val="0"/>
-              </w:rPr>
-              <w:t xml:space="preserve">3</w:t>
-            </w:r>
-            <w:r>
-              <w:rPr>
-                <w:rFonts w:ascii="Calibri" w:hAnsi="Calibri"/>
-                <w:sz w:val="18"/>
-              </w:rPr>
-            </w:r>
-            <w:r/>
+                <w:b/>
+                <w:sz w:val="16"/>
+              </w:rPr>
+              <w:t>Этап 3: UI слой фреймворка и UI автотесты</w:t>
+              <w:br/>
+              <w:t>Срок: 1 неделя (3-я неделя проекта)</w:t>
+            </w:r>
           </w:p>
         </w:tc>
         <w:tc>
           <w:tcPr>
-            <w:shd w:val="clear" w:color="auto" w:fill="ffffff"/>
-            <w:tcBorders/>
-            <w:tcMar>
-              <w:left w:w="120" w:type="dxa"/>
-              <w:top w:w="80" w:type="dxa"/>
-              <w:right w:w="120" w:type="dxa"/>
-              <w:bottom w:w="80" w:type="dxa"/>
-            </w:tcMar>
+            <w:tcW w:type="dxa" w:w="3264"/>
             <w:vAlign w:val="center"/>
           </w:tcPr>
           <w:p>
             <w:pPr>
-              <w:pBdr/>
-              <w:spacing w:after="0" w:line="252" w:lineRule="auto"/>
-              <w:ind/>
-              <w:rPr/>
+              <w:spacing w:after="0" w:line="240" w:lineRule="auto"/>
             </w:pPr>
             <w:r>
               <w:rPr>
-                <w:rFonts w:ascii="Calibri" w:hAnsi="Calibri" w:eastAsia="Calibri" w:cs="Calibri"/>
-                <w:sz w:val="18"/>
-                <w:szCs w:val="19"/>
-                <w:rtl w:val="0"/>
-              </w:rPr>
-              <w:t xml:space="preserve">API автотесты + build lifecycle</w:t>
-            </w:r>
-            <w:r>
-              <w:rPr>
-                <w:rFonts w:ascii="Calibri" w:hAnsi="Calibri"/>
-                <w:sz w:val="18"/>
-              </w:rPr>
-            </w:r>
-            <w:r/>
+                <w:sz w:val="16"/>
+              </w:rPr>
+              <w:t>Добавить UI слой во фреймворк и автоматизировать только те пользовательские flows, которые нельзя надежно заменить API.</w:t>
+            </w:r>
           </w:p>
         </w:tc>
         <w:tc>
           <w:tcPr>
-            <w:shd w:val="clear" w:color="auto" w:fill="ffffff"/>
-            <w:tcBorders/>
-            <w:tcMar>
-              <w:left w:w="120" w:type="dxa"/>
-              <w:top w:w="80" w:type="dxa"/>
-              <w:right w:w="120" w:type="dxa"/>
-              <w:bottom w:w="80" w:type="dxa"/>
-            </w:tcMar>
+            <w:tcW w:type="dxa" w:w="3264"/>
             <w:vAlign w:val="center"/>
           </w:tcPr>
           <w:p>
             <w:pPr>
-              <w:pBdr/>
-              <w:spacing w:after="0" w:line="252" w:lineRule="auto"/>
-              <w:ind/>
-              <w:rPr/>
+              <w:spacing w:after="0" w:line="240" w:lineRule="auto"/>
             </w:pPr>
             <w:r>
               <w:rPr>
-                <w:rFonts w:ascii="Calibri" w:hAnsi="Calibri"/>
-                <w:b w:val="0"/>
-                <w:sz w:val="18"/>
-              </w:rPr>
-              <w:t xml:space="preserve">Автоматизированы REST API сценарии: server readiness, project, build configuration, run build, build status, permission negative checks, cleanup.</w:t>
-            </w:r>
-            <w:r/>
+                <w:sz w:val="16"/>
+              </w:rPr>
+              <w:t>Ключевые шаги: добавить Playwright layer, pages/components, стабильные локаторы и ожидания; настроить screenshots/video/trace; реализовать UI автотесты для startup confirmation, database setup, создания первого администратора, login и authorization agent; продолжить параллельную подготовку pipeline. Результат: UI smoke покрывает критичный пользовательский путь и дает диагностические артефакты при падениях.</w:t>
+            </w:r>
           </w:p>
         </w:tc>
       </w:tr>
@@ -15240,113 +15029,56 @@
         </w:trPr>
         <w:tc>
           <w:tcPr>
-            <w:shd w:val="clear" w:color="auto" w:fill="ffffff"/>
-            <w:tcBorders/>
-            <w:tcMar>
-              <w:left w:w="120" w:type="dxa"/>
-              <w:top w:w="80" w:type="dxa"/>
-              <w:right w:w="120" w:type="dxa"/>
-              <w:bottom w:w="80" w:type="dxa"/>
-            </w:tcMar>
+            <w:tcW w:type="dxa" w:w="3264"/>
             <w:vAlign w:val="center"/>
           </w:tcPr>
           <w:p>
             <w:pPr>
-              <w:pBdr/>
-              <w:spacing w:after="0" w:line="252" w:lineRule="auto"/>
-              <w:ind/>
-              <w:rPr/>
+              <w:spacing w:after="0" w:line="240" w:lineRule="auto"/>
             </w:pPr>
             <w:r>
               <w:rPr>
-                <w:rFonts w:ascii="Calibri" w:hAnsi="Calibri" w:eastAsia="Calibri" w:cs="Calibri"/>
-                <w:sz w:val="18"/>
-                <w:szCs w:val="19"/>
-                <w:rtl w:val="0"/>
-              </w:rPr>
-              <w:t xml:space="preserve">4</w:t>
-            </w:r>
-            <w:r>
-              <w:rPr>
-                <w:rFonts w:ascii="Calibri" w:hAnsi="Calibri"/>
-                <w:sz w:val="18"/>
-              </w:rPr>
-            </w:r>
-            <w:r/>
+                <w:b/>
+                <w:sz w:val="16"/>
+              </w:rPr>
+              <w:t>Этап 4: CI/CD, отчетность и quality gates</w:t>
+              <w:br/>
+              <w:t>Срок: 1 неделя (4-я неделя проекта)</w:t>
+            </w:r>
           </w:p>
         </w:tc>
         <w:tc>
           <w:tcPr>
-            <w:shd w:val="clear" w:color="auto" w:fill="ffffff"/>
-            <w:tcBorders/>
-            <w:tcMar>
-              <w:left w:w="120" w:type="dxa"/>
-              <w:top w:w="80" w:type="dxa"/>
-              <w:right w:w="120" w:type="dxa"/>
-              <w:bottom w:w="80" w:type="dxa"/>
-            </w:tcMar>
+            <w:tcW w:type="dxa" w:w="3264"/>
             <w:vAlign w:val="center"/>
           </w:tcPr>
           <w:p>
             <w:pPr>
-              <w:pBdr/>
-              <w:spacing w:after="0" w:line="252" w:lineRule="auto"/>
-              <w:ind/>
-              <w:rPr/>
+              <w:spacing w:after="0" w:line="240" w:lineRule="auto"/>
             </w:pPr>
             <w:r>
               <w:rPr>
-                <w:rFonts w:ascii="Calibri" w:hAnsi="Calibri" w:eastAsia="Calibri" w:cs="Calibri"/>
-                <w:sz w:val="18"/>
-                <w:szCs w:val="19"/>
-                <w:rtl w:val="0"/>
-              </w:rPr>
-              <w:t xml:space="preserve">Pipeline, bootstrap, отчеты</w:t>
-            </w:r>
-            <w:r>
-              <w:rPr>
-                <w:rFonts w:ascii="Calibri" w:hAnsi="Calibri"/>
-                <w:sz w:val="18"/>
-              </w:rPr>
-            </w:r>
-            <w:r/>
+                <w:sz w:val="16"/>
+              </w:rPr>
+              <w:t>Собрать воспроизводимый pipeline, который поднимает стенд, запускает автотесты, публикует отчет и блокирует некачественный результат.</w:t>
+            </w:r>
           </w:p>
         </w:tc>
         <w:tc>
           <w:tcPr>
-            <w:shd w:val="clear" w:color="auto" w:fill="ffffff"/>
-            <w:tcBorders/>
-            <w:tcMar>
-              <w:left w:w="120" w:type="dxa"/>
-              <w:top w:w="80" w:type="dxa"/>
-              <w:right w:w="120" w:type="dxa"/>
-              <w:bottom w:w="80" w:type="dxa"/>
-            </w:tcMar>
+            <w:tcW w:type="dxa" w:w="3264"/>
             <w:vAlign w:val="center"/>
           </w:tcPr>
           <w:p>
             <w:pPr>
-              <w:pBdr/>
-              <w:spacing w:after="0" w:line="252" w:lineRule="auto"/>
-              <w:ind/>
-              <w:rPr/>
+              <w:spacing w:after="0" w:line="240" w:lineRule="auto"/>
             </w:pPr>
             <w:r>
               <w:rPr>
-                <w:rFonts w:ascii="Calibri" w:hAnsi="Calibri" w:eastAsia="Calibri" w:cs="Calibri"/>
-                <w:sz w:val="18"/>
-                <w:szCs w:val="19"/>
-                <w:rtl w:val="0"/>
-              </w:rPr>
-              <w:t xml:space="preserve">Собран CI flow: поднятие стенда, bootstrap, запуск UI/API suites, отчетность и стабилизация.</w:t>
-            </w:r>
-            <w:r>
-              <w:rPr>
-                <w:rFonts w:ascii="Calibri" w:hAnsi="Calibri"/>
-                <w:sz w:val="18"/>
-              </w:rPr>
-            </w:r>
-            <w:r/>
+                <w:sz w:val="16"/>
+              </w:rPr>
+              <w:t>Ключевые шаги: настроить bootstrap TeamCity стенда; запуск API/UI/E2E suites; публикацию Allure Report; сбор метрик pass rate, fail rate, duration, flaky failures, failed/skipped tests; quality gates автотестов; Telegram bot уведомления со статусом прогона, ссылкой на отчет и списком критичных падений; стабилизацию flaky тестов. Результат: готов demo-прогон MVP автоматизации в CI/CD.</w:t>
+            </w:r>
           </w:p>
         </w:tc>
       </w:tr>

</xml_diff>

<commit_message>
Update TeamCity test plan scope
</commit_message>
<xml_diff>
--- a/docs/Тест План по Автоматизации Тестирования - TeamCity.docx
+++ b/docs/Тест План по Автоматизации Тестирования - TeamCity.docx
@@ -2098,95 +2098,8 @@
             <w:vAlign w:val="center"/>
           </w:tcPr>
           <w:p>
-            <w:pPr>
-              <w:spacing w:after="0" w:line="259" w:lineRule="auto"/>
-            </w:pPr>
-            <w:r>
-              <w:rPr>
-                <w:sz w:val="19"/>
-                <w:szCs w:val="19"/>
-              </w:rPr>
-              <w:t xml:space="preserve">Fast CI </w:t>
-            </w:r>
-            <w:proofErr w:type="spellStart"/>
-            <w:r>
-              <w:rPr>
-                <w:sz w:val="19"/>
-                <w:szCs w:val="19"/>
-              </w:rPr>
-              <w:t>на</w:t>
-            </w:r>
-            <w:proofErr w:type="spellEnd"/>
-            <w:r>
-              <w:rPr>
-                <w:sz w:val="19"/>
-                <w:szCs w:val="19"/>
-              </w:rPr>
-              <w:t xml:space="preserve"> internal HSQLDB, production-like CI </w:t>
-            </w:r>
-            <w:proofErr w:type="spellStart"/>
-            <w:r>
-              <w:rPr>
-                <w:sz w:val="19"/>
-                <w:szCs w:val="19"/>
-              </w:rPr>
-              <w:t>на</w:t>
-            </w:r>
-            <w:proofErr w:type="spellEnd"/>
-            <w:r>
-              <w:rPr>
-                <w:sz w:val="19"/>
-                <w:szCs w:val="19"/>
-              </w:rPr>
-              <w:t xml:space="preserve"> PostgreSQL, compatibility smoke </w:t>
-            </w:r>
-            <w:proofErr w:type="spellStart"/>
-            <w:r>
-              <w:rPr>
-                <w:sz w:val="19"/>
-                <w:szCs w:val="19"/>
-              </w:rPr>
-              <w:t>на</w:t>
-            </w:r>
-            <w:proofErr w:type="spellEnd"/>
-            <w:r>
-              <w:rPr>
-                <w:sz w:val="19"/>
-                <w:szCs w:val="19"/>
-              </w:rPr>
-              <w:t xml:space="preserve"> </w:t>
-            </w:r>
-            <w:proofErr w:type="spellStart"/>
-            <w:r>
-              <w:rPr>
-                <w:sz w:val="19"/>
-                <w:szCs w:val="19"/>
-              </w:rPr>
-              <w:t>остальных</w:t>
-            </w:r>
-            <w:proofErr w:type="spellEnd"/>
-            <w:r>
-              <w:rPr>
-                <w:sz w:val="19"/>
-                <w:szCs w:val="19"/>
-              </w:rPr>
-              <w:t xml:space="preserve"> </w:t>
-            </w:r>
-            <w:proofErr w:type="spellStart"/>
-            <w:r>
-              <w:rPr>
-                <w:sz w:val="19"/>
-                <w:szCs w:val="19"/>
-              </w:rPr>
-              <w:t>поддерживаемых</w:t>
-            </w:r>
-            <w:proofErr w:type="spellEnd"/>
-            <w:r>
-              <w:rPr>
-                <w:sz w:val="19"/>
-                <w:szCs w:val="19"/>
-              </w:rPr>
-              <w:t xml:space="preserve"> БД.</w:t>
+            <w:r>
+              <w:t>Fast CI на internal HSQLDB, production-like CI на PostgreSQL, compatibility regression на остальных поддерживаемых БД.</w:t>
             </w:r>
           </w:p>
         </w:tc>
@@ -4237,64 +4150,8 @@
             <w:hideMark/>
           </w:tcPr>
           <w:p>
-            <w:pPr>
-              <w:rPr>
-                <w:lang w:val="ru-RU"/>
-              </w:rPr>
-            </w:pPr>
-            <w:r>
-              <w:rPr>
-                <w:lang w:val="ru-RU"/>
-              </w:rPr>
-              <w:t>Только</w:t>
-            </w:r>
-            <w:r>
-              <w:rPr>
-                <w:lang w:val="en-US"/>
-              </w:rPr>
-              <w:t xml:space="preserve"> </w:t>
-            </w:r>
-            <w:r>
-              <w:rPr>
-                <w:lang w:val="ru-RU"/>
-              </w:rPr>
-              <w:t>минимальный</w:t>
-            </w:r>
-            <w:r>
-              <w:rPr>
-                <w:lang w:val="en-US"/>
-              </w:rPr>
-              <w:t xml:space="preserve"> UI smoke: login/logout, Projects page, </w:t>
-            </w:r>
-            <w:r>
-              <w:rPr>
-                <w:lang w:val="ru-RU"/>
-              </w:rPr>
-              <w:t>переход</w:t>
-            </w:r>
-            <w:r>
-              <w:rPr>
-                <w:lang w:val="en-US"/>
-              </w:rPr>
-              <w:t xml:space="preserve"> </w:t>
-            </w:r>
-            <w:r>
-              <w:rPr>
-                <w:lang w:val="ru-RU"/>
-              </w:rPr>
-              <w:t>к</w:t>
-            </w:r>
-            <w:r>
-              <w:rPr>
-                <w:lang w:val="en-US"/>
-              </w:rPr>
-              <w:t xml:space="preserve"> Build Configuration Settings, Queue/Build Result read-only. </w:t>
-            </w:r>
-            <w:r>
-              <w:rPr>
-                <w:lang w:val="ru-RU"/>
-              </w:rPr>
-              <w:t>UI не создает основные тестовые данные.</w:t>
+            <w:r>
+              <w:t>Один минимальный UI happy path: login, Projects page, переход к заранее созданной через API Build Configuration, Queue/Build Result read-only. UI не создает и не меняет тестовые данные.</w:t>
             </w:r>
           </w:p>
         </w:tc>
@@ -5408,34 +5265,8 @@
             <w:hideMark/>
           </w:tcPr>
           <w:p>
-            <w:pPr>
-              <w:rPr>
-                <w:lang w:val="en-US"/>
-              </w:rPr>
-            </w:pPr>
-            <w:r>
-              <w:rPr>
-                <w:lang w:val="en-US"/>
-              </w:rPr>
-              <w:t xml:space="preserve">Out of Scope </w:t>
-            </w:r>
-            <w:r>
-              <w:rPr>
-                <w:lang w:val="ru-RU"/>
-              </w:rPr>
-              <w:t>на</w:t>
-            </w:r>
-            <w:r>
-              <w:rPr>
-                <w:lang w:val="en-US"/>
-              </w:rPr>
-              <w:t xml:space="preserve"> </w:t>
-            </w:r>
-            <w:r>
-              <w:rPr>
-                <w:lang w:val="ru-RU"/>
-              </w:rPr>
-              <w:t>старте</w:t>
+            <w:r>
+              <w:t>P1</w:t>
             </w:r>
           </w:p>
         </w:tc>
@@ -5446,25 +5277,9 @@
             <w:hideMark/>
           </w:tcPr>
           <w:p>
-            <w:pPr>
-              <w:rPr>
-                <w:lang w:val="ru-RU"/>
-              </w:rPr>
-            </w:pPr>
-            <w:r>
-              <w:rPr>
-                <w:lang w:val="ru-RU"/>
-              </w:rPr>
-              <w:t xml:space="preserve">Database </w:t>
-            </w:r>
-            <w:proofErr w:type="spellStart"/>
-            <w:r>
-              <w:rPr>
-                <w:lang w:val="ru-RU"/>
-              </w:rPr>
-              <w:t>Compatibility</w:t>
-            </w:r>
-            <w:proofErr w:type="spellEnd"/>
+            <w:r>
+              <w:t>Database Compatibility Regression</w:t>
+            </w:r>
           </w:p>
         </w:tc>
         <w:tc>
@@ -5474,86 +5289,8 @@
             <w:hideMark/>
           </w:tcPr>
           <w:p>
-            <w:pPr>
-              <w:rPr>
-                <w:lang w:val="ru-RU"/>
-              </w:rPr>
-            </w:pPr>
-            <w:r>
-              <w:rPr>
-                <w:lang w:val="ru-RU"/>
-              </w:rPr>
-              <w:t>MySQL/</w:t>
-            </w:r>
-            <w:proofErr w:type="spellStart"/>
-            <w:r>
-              <w:rPr>
-                <w:lang w:val="ru-RU"/>
-              </w:rPr>
-              <w:t>MariaDB</w:t>
-            </w:r>
-            <w:proofErr w:type="spellEnd"/>
-            <w:r>
-              <w:rPr>
-                <w:lang w:val="ru-RU"/>
-              </w:rPr>
-              <w:t xml:space="preserve">/MS SQL/Oracle </w:t>
-            </w:r>
-            <w:proofErr w:type="spellStart"/>
-            <w:r>
-              <w:rPr>
-                <w:lang w:val="ru-RU"/>
-              </w:rPr>
-              <w:t>regression</w:t>
-            </w:r>
-            <w:proofErr w:type="spellEnd"/>
-            <w:r>
-              <w:rPr>
-                <w:lang w:val="ru-RU"/>
-              </w:rPr>
-              <w:t xml:space="preserve"> не входит в первые 4 недели. Максимум — текущая БД стенда как часть </w:t>
-            </w:r>
-            <w:proofErr w:type="spellStart"/>
-            <w:r>
-              <w:rPr>
-                <w:lang w:val="ru-RU"/>
-              </w:rPr>
-              <w:t>readiness</w:t>
-            </w:r>
-            <w:proofErr w:type="spellEnd"/>
-            <w:r>
-              <w:rPr>
-                <w:lang w:val="ru-RU"/>
-              </w:rPr>
-              <w:t xml:space="preserve"> и </w:t>
-            </w:r>
-            <w:proofErr w:type="spellStart"/>
-            <w:r>
-              <w:rPr>
-                <w:lang w:val="ru-RU"/>
-              </w:rPr>
-              <w:t>PostgreSQL</w:t>
-            </w:r>
-            <w:proofErr w:type="spellEnd"/>
-            <w:r>
-              <w:rPr>
-                <w:lang w:val="ru-RU"/>
-              </w:rPr>
-              <w:t xml:space="preserve"> как внешняя </w:t>
-            </w:r>
-            <w:proofErr w:type="spellStart"/>
-            <w:r>
-              <w:rPr>
-                <w:lang w:val="ru-RU"/>
-              </w:rPr>
-              <w:t>бд</w:t>
-            </w:r>
-            <w:proofErr w:type="spellEnd"/>
-            <w:r>
-              <w:rPr>
-                <w:lang w:val="ru-RU"/>
-              </w:rPr>
-              <w:t>.</w:t>
+            <w:r>
+              <w:t>Входит в MVP: PostgreSQL production-like и MySQL/MariaDB/MS SQL/Oracle compatibility regression. Проверяем bootstrap, schema readiness, REST API, authorized/connected agent, project/build configuration, простой build и build result.</w:t>
             </w:r>
           </w:p>
         </w:tc>
@@ -5564,16 +5301,8 @@
             <w:hideMark/>
           </w:tcPr>
           <w:p>
-            <w:pPr>
-              <w:rPr>
-                <w:lang w:val="ru-RU"/>
-              </w:rPr>
-            </w:pPr>
-            <w:r>
-              <w:rPr>
-                <w:lang w:val="ru-RU"/>
-              </w:rPr>
-              <w:t>Не назначается на первые 4 недели</w:t>
+            <w:r>
+              <w:t>QA Automation Engineers</w:t>
             </w:r>
           </w:p>
         </w:tc>
@@ -6271,83 +6000,8 @@
             <w:vAlign w:val="center"/>
           </w:tcPr>
           <w:p>
-            <w:pPr>
-              <w:spacing w:after="0" w:line="259" w:lineRule="auto"/>
-              <w:rPr>
-                <w:lang w:val="ru-RU"/>
-              </w:rPr>
-            </w:pPr>
-            <w:r>
-              <w:rPr>
-                <w:sz w:val="18"/>
-                <w:lang w:val="ru-RU"/>
-              </w:rPr>
-              <w:t xml:space="preserve">К концу 4-й недели </w:t>
-            </w:r>
-            <w:r>
-              <w:rPr>
-                <w:sz w:val="18"/>
-              </w:rPr>
-              <w:t>pipeline</w:t>
-            </w:r>
-            <w:r>
-              <w:rPr>
-                <w:sz w:val="18"/>
-                <w:lang w:val="ru-RU"/>
-              </w:rPr>
-              <w:t xml:space="preserve"> поднимает стенд, выполняет </w:t>
-            </w:r>
-            <w:r>
-              <w:rPr>
-                <w:sz w:val="18"/>
-              </w:rPr>
-              <w:t>bootstrap</w:t>
-            </w:r>
-            <w:r>
-              <w:rPr>
-                <w:sz w:val="18"/>
-                <w:lang w:val="ru-RU"/>
-              </w:rPr>
-              <w:t xml:space="preserve">, запускает </w:t>
-            </w:r>
-            <w:r>
-              <w:rPr>
-                <w:sz w:val="18"/>
-              </w:rPr>
-              <w:t>UI</w:t>
-            </w:r>
-            <w:r>
-              <w:rPr>
-                <w:sz w:val="18"/>
-                <w:lang w:val="ru-RU"/>
-              </w:rPr>
-              <w:t>/</w:t>
-            </w:r>
-            <w:r>
-              <w:rPr>
-                <w:sz w:val="18"/>
-              </w:rPr>
-              <w:t>API</w:t>
-            </w:r>
-            <w:r>
-              <w:rPr>
-                <w:sz w:val="18"/>
-                <w:lang w:val="ru-RU"/>
-              </w:rPr>
-              <w:t xml:space="preserve"> </w:t>
-            </w:r>
-            <w:r>
-              <w:rPr>
-                <w:sz w:val="18"/>
-              </w:rPr>
-              <w:t>suites</w:t>
-            </w:r>
-            <w:r>
-              <w:rPr>
-                <w:sz w:val="18"/>
-                <w:lang w:val="ru-RU"/>
-              </w:rPr>
-              <w:t xml:space="preserve"> и публикует отчет.</w:t>
+            <w:r>
+              <w:t>К концу 4-й недели pipeline поднимает стенд, выполняет bootstrap, запускает UI/API/E2E suites, DB compatibility jobs и публикует отчет.</w:t>
             </w:r>
           </w:p>
         </w:tc>
@@ -12836,15 +12490,8 @@
             <w:vAlign w:val="center"/>
           </w:tcPr>
           <w:p>
-            <w:pPr>
-              <w:spacing w:after="0" w:line="259" w:lineRule="auto"/>
-            </w:pPr>
-            <w:r>
-              <w:rPr>
-                <w:sz w:val="19"/>
-                <w:szCs w:val="19"/>
-              </w:rPr>
-              <w:t>DB Compatibility Nightly</w:t>
+            <w:r>
+              <w:t>DB Compatibility MVP / Nightly</w:t>
             </w:r>
           </w:p>
         </w:tc>
@@ -12861,15 +12508,8 @@
             <w:vAlign w:val="center"/>
           </w:tcPr>
           <w:p>
-            <w:pPr>
-              <w:spacing w:after="0" w:line="259" w:lineRule="auto"/>
-            </w:pPr>
-            <w:r>
-              <w:rPr>
-                <w:sz w:val="19"/>
-                <w:szCs w:val="19"/>
-              </w:rPr>
-              <w:t>Server + full Agent + MySQL/MariaDB/MS SQL/Oracle</w:t>
+            <w:r>
+              <w:t>Server + full Agent + PostgreSQL/MySQL/MariaDB/MS SQL/Oracle</w:t>
             </w:r>
           </w:p>
         </w:tc>
@@ -12886,56 +12526,8 @@
             <w:vAlign w:val="center"/>
           </w:tcPr>
           <w:p>
-            <w:pPr>
-              <w:spacing w:after="0" w:line="259" w:lineRule="auto"/>
-              <w:rPr>
-                <w:lang w:val="ru-RU"/>
-              </w:rPr>
-            </w:pPr>
-            <w:r>
-              <w:rPr>
-                <w:sz w:val="19"/>
-                <w:szCs w:val="19"/>
-              </w:rPr>
-              <w:t>Smoke</w:t>
-            </w:r>
-            <w:r>
-              <w:rPr>
-                <w:sz w:val="19"/>
-                <w:szCs w:val="19"/>
-                <w:lang w:val="ru-RU"/>
-              </w:rPr>
-              <w:t xml:space="preserve">-проверка совместимости с поддерживаемыми </w:t>
-            </w:r>
-            <w:r>
-              <w:rPr>
-                <w:sz w:val="19"/>
-                <w:szCs w:val="19"/>
-              </w:rPr>
-              <w:t>database</w:t>
-            </w:r>
-            <w:r>
-              <w:rPr>
-                <w:sz w:val="19"/>
-                <w:szCs w:val="19"/>
-                <w:lang w:val="ru-RU"/>
-              </w:rPr>
-              <w:t xml:space="preserve"> </w:t>
-            </w:r>
-            <w:r>
-              <w:rPr>
-                <w:sz w:val="19"/>
-                <w:szCs w:val="19"/>
-              </w:rPr>
-              <w:t>backends</w:t>
-            </w:r>
-            <w:r>
-              <w:rPr>
-                <w:sz w:val="19"/>
-                <w:szCs w:val="19"/>
-                <w:lang w:val="ru-RU"/>
-              </w:rPr>
-              <w:t>.</w:t>
+            <w:r>
+              <w:t>MVP compatibility regression для поддерживаемых database backends: bootstrap, schema readiness, REST API, agent, project/build configuration, build run и build result.</w:t>
             </w:r>
           </w:p>
         </w:tc>
@@ -15345,122 +14937,7 @@
         </w:rPr>
       </w:pPr>
       <w:r>
-        <w:rPr>
-          <w:lang w:val="ru-RU"/>
-        </w:rPr>
-        <w:t xml:space="preserve">На первом этапе UI-автоматизация покрывает только минимальные критичные пользовательские </w:t>
-      </w:r>
-      <w:proofErr w:type="spellStart"/>
-      <w:r>
-        <w:rPr>
-          <w:lang w:val="ru-RU"/>
-        </w:rPr>
-        <w:t>flows</w:t>
-      </w:r>
-      <w:proofErr w:type="spellEnd"/>
-      <w:r>
-        <w:rPr>
-          <w:lang w:val="ru-RU"/>
-        </w:rPr>
-        <w:t xml:space="preserve">, где важно проверить именно интерфейс: </w:t>
-      </w:r>
-      <w:proofErr w:type="spellStart"/>
-      <w:r>
-        <w:rPr>
-          <w:lang w:val="ru-RU"/>
-        </w:rPr>
-        <w:t>login</w:t>
-      </w:r>
-      <w:proofErr w:type="spellEnd"/>
-      <w:r>
-        <w:rPr>
-          <w:lang w:val="ru-RU"/>
-        </w:rPr>
-        <w:t>/</w:t>
-      </w:r>
-      <w:proofErr w:type="spellStart"/>
-      <w:r>
-        <w:rPr>
-          <w:lang w:val="ru-RU"/>
-        </w:rPr>
-        <w:t>logout</w:t>
-      </w:r>
-      <w:proofErr w:type="spellEnd"/>
-      <w:r>
-        <w:rPr>
-          <w:lang w:val="ru-RU"/>
-        </w:rPr>
-        <w:t xml:space="preserve">, доступность </w:t>
-      </w:r>
-      <w:proofErr w:type="spellStart"/>
-      <w:r>
-        <w:rPr>
-          <w:lang w:val="ru-RU"/>
-        </w:rPr>
-        <w:t>Projects</w:t>
-      </w:r>
-      <w:proofErr w:type="spellEnd"/>
-      <w:r>
-        <w:rPr>
-          <w:lang w:val="ru-RU"/>
-        </w:rPr>
-        <w:t xml:space="preserve"> </w:t>
-      </w:r>
-      <w:proofErr w:type="spellStart"/>
-      <w:r>
-        <w:rPr>
-          <w:lang w:val="ru-RU"/>
-        </w:rPr>
-        <w:t>page</w:t>
-      </w:r>
-      <w:proofErr w:type="spellEnd"/>
-      <w:r>
-        <w:rPr>
-          <w:lang w:val="ru-RU"/>
-        </w:rPr>
-        <w:t xml:space="preserve">, базовую навигацию к Project, </w:t>
-      </w:r>
-      <w:proofErr w:type="spellStart"/>
-      <w:r>
-        <w:rPr>
-          <w:lang w:val="ru-RU"/>
-        </w:rPr>
-        <w:t>Build</w:t>
-      </w:r>
-      <w:proofErr w:type="spellEnd"/>
-      <w:r>
-        <w:rPr>
-          <w:lang w:val="ru-RU"/>
-        </w:rPr>
-        <w:t xml:space="preserve"> Configuration </w:t>
-      </w:r>
-      <w:proofErr w:type="spellStart"/>
-      <w:r>
-        <w:rPr>
-          <w:lang w:val="ru-RU"/>
-        </w:rPr>
-        <w:t>Settings</w:t>
-      </w:r>
-      <w:proofErr w:type="spellEnd"/>
-      <w:r>
-        <w:rPr>
-          <w:lang w:val="ru-RU"/>
-        </w:rPr>
-        <w:t xml:space="preserve"> и </w:t>
-      </w:r>
-      <w:proofErr w:type="spellStart"/>
-      <w:r>
-        <w:rPr>
-          <w:lang w:val="ru-RU"/>
-        </w:rPr>
-        <w:t>Queue</w:t>
-      </w:r>
-      <w:proofErr w:type="spellEnd"/>
-      <w:r>
-        <w:rPr>
-          <w:lang w:val="ru-RU"/>
-        </w:rPr>
-        <w:t>.</w:t>
+        <w:t>На первом этапе UI-автоматизация ограничивается одним happy path: login, открытие Projects page, переход к заранее созданным через API project/build configuration и read-only проверка Queue/Build Result. UI не создает и не изменяет тестовые данные.</w:t>
       </w:r>
     </w:p>
     <w:p>
@@ -15469,89 +14946,8 @@
           <w:lang w:val="ru-RU"/>
         </w:rPr>
       </w:pPr>
-      <w:proofErr w:type="spellStart"/>
-      <w:r>
-        <w:rPr>
-          <w:lang w:val="ru-RU"/>
-        </w:rPr>
-        <w:t>Initial</w:t>
-      </w:r>
-      <w:proofErr w:type="spellEnd"/>
-      <w:r>
-        <w:rPr>
-          <w:lang w:val="ru-RU"/>
-        </w:rPr>
-        <w:t xml:space="preserve"> </w:t>
-      </w:r>
-      <w:proofErr w:type="spellStart"/>
-      <w:r>
-        <w:rPr>
-          <w:lang w:val="ru-RU"/>
-        </w:rPr>
-        <w:t>setup</w:t>
-      </w:r>
-      <w:proofErr w:type="spellEnd"/>
-      <w:r>
-        <w:rPr>
-          <w:lang w:val="ru-RU"/>
-        </w:rPr>
-        <w:t xml:space="preserve">, </w:t>
-      </w:r>
-      <w:proofErr w:type="spellStart"/>
-      <w:r>
-        <w:rPr>
-          <w:lang w:val="ru-RU"/>
-        </w:rPr>
-        <w:t>database</w:t>
-      </w:r>
-      <w:proofErr w:type="spellEnd"/>
-      <w:r>
-        <w:rPr>
-          <w:lang w:val="ru-RU"/>
-        </w:rPr>
-        <w:t xml:space="preserve"> </w:t>
-      </w:r>
-      <w:proofErr w:type="spellStart"/>
-      <w:r>
-        <w:rPr>
-          <w:lang w:val="ru-RU"/>
-        </w:rPr>
-        <w:t>setup</w:t>
-      </w:r>
-      <w:proofErr w:type="spellEnd"/>
-      <w:r>
-        <w:rPr>
-          <w:lang w:val="ru-RU"/>
-        </w:rPr>
-        <w:t xml:space="preserve">, создание первого администратора, установка и авторизация </w:t>
-      </w:r>
-      <w:proofErr w:type="spellStart"/>
-      <w:r>
-        <w:rPr>
-          <w:lang w:val="ru-RU"/>
-        </w:rPr>
-        <w:t>TeamCity</w:t>
-      </w:r>
-      <w:proofErr w:type="spellEnd"/>
-      <w:r>
-        <w:rPr>
-          <w:lang w:val="ru-RU"/>
-        </w:rPr>
-        <w:t xml:space="preserve"> Agent не входят в MVP-</w:t>
-      </w:r>
-      <w:proofErr w:type="spellStart"/>
-      <w:r>
-        <w:rPr>
-          <w:lang w:val="ru-RU"/>
-        </w:rPr>
-        <w:t>scope</w:t>
-      </w:r>
-      <w:proofErr w:type="spellEnd"/>
-      <w:r>
-        <w:rPr>
-          <w:lang w:val="ru-RU"/>
-        </w:rPr>
-        <w:t>.</w:t>
+      <w:r>
+        <w:t>Initial setup, database setup, создание первого администратора, установка и авторизация TeamCity Agent не автоматизируются через UI в MVP; если эти шаги нужны для окружения, они выполняются bootstrap/API на уровне подготовки стенда.</w:t>
       </w:r>
     </w:p>
     <w:p>
@@ -15561,178 +14957,7 @@
         </w:rPr>
       </w:pPr>
       <w:r>
-        <w:rPr>
-          <w:lang w:val="ru-RU"/>
-        </w:rPr>
-        <w:t xml:space="preserve">Подготовка тестовых данных, создание </w:t>
-      </w:r>
-      <w:proofErr w:type="spellStart"/>
-      <w:r>
-        <w:rPr>
-          <w:lang w:val="ru-RU"/>
-        </w:rPr>
-        <w:t>project</w:t>
-      </w:r>
-      <w:proofErr w:type="spellEnd"/>
-      <w:r>
-        <w:rPr>
-          <w:lang w:val="ru-RU"/>
-        </w:rPr>
-        <w:t>/</w:t>
-      </w:r>
-      <w:proofErr w:type="spellStart"/>
-      <w:r>
-        <w:rPr>
-          <w:lang w:val="ru-RU"/>
-        </w:rPr>
-        <w:t>build</w:t>
-      </w:r>
-      <w:proofErr w:type="spellEnd"/>
-      <w:r>
-        <w:rPr>
-          <w:lang w:val="ru-RU"/>
-        </w:rPr>
-        <w:t xml:space="preserve"> </w:t>
-      </w:r>
-      <w:proofErr w:type="spellStart"/>
-      <w:r>
-        <w:rPr>
-          <w:lang w:val="ru-RU"/>
-        </w:rPr>
-        <w:t>configuration</w:t>
-      </w:r>
-      <w:proofErr w:type="spellEnd"/>
-      <w:r>
-        <w:rPr>
-          <w:lang w:val="ru-RU"/>
-        </w:rPr>
-        <w:t xml:space="preserve">/VCS </w:t>
-      </w:r>
-      <w:proofErr w:type="spellStart"/>
-      <w:r>
-        <w:rPr>
-          <w:lang w:val="ru-RU"/>
-        </w:rPr>
-        <w:t>root</w:t>
-      </w:r>
-      <w:proofErr w:type="spellEnd"/>
-      <w:r>
-        <w:rPr>
-          <w:lang w:val="ru-RU"/>
-        </w:rPr>
-        <w:t xml:space="preserve">, запуск </w:t>
-      </w:r>
-      <w:proofErr w:type="spellStart"/>
-      <w:r>
-        <w:rPr>
-          <w:lang w:val="ru-RU"/>
-        </w:rPr>
-        <w:t>build</w:t>
-      </w:r>
-      <w:proofErr w:type="spellEnd"/>
-      <w:r>
-        <w:rPr>
-          <w:lang w:val="ru-RU"/>
-        </w:rPr>
-        <w:t xml:space="preserve">, проверка </w:t>
-      </w:r>
-      <w:proofErr w:type="spellStart"/>
-      <w:r>
-        <w:rPr>
-          <w:lang w:val="ru-RU"/>
-        </w:rPr>
-        <w:t>queue</w:t>
-      </w:r>
-      <w:proofErr w:type="spellEnd"/>
-      <w:r>
-        <w:rPr>
-          <w:lang w:val="ru-RU"/>
-        </w:rPr>
-        <w:t>/</w:t>
-      </w:r>
-      <w:proofErr w:type="spellStart"/>
-      <w:r>
-        <w:rPr>
-          <w:lang w:val="ru-RU"/>
-        </w:rPr>
-        <w:t>build</w:t>
-      </w:r>
-      <w:proofErr w:type="spellEnd"/>
-      <w:r>
-        <w:rPr>
-          <w:lang w:val="ru-RU"/>
-        </w:rPr>
-        <w:t xml:space="preserve"> </w:t>
-      </w:r>
-      <w:proofErr w:type="spellStart"/>
-      <w:r>
-        <w:rPr>
-          <w:lang w:val="ru-RU"/>
-        </w:rPr>
-        <w:t>status</w:t>
-      </w:r>
-      <w:proofErr w:type="spellEnd"/>
-      <w:r>
-        <w:rPr>
-          <w:lang w:val="ru-RU"/>
-        </w:rPr>
-        <w:t>/</w:t>
-      </w:r>
-      <w:proofErr w:type="spellStart"/>
-      <w:r>
-        <w:rPr>
-          <w:lang w:val="ru-RU"/>
-        </w:rPr>
-        <w:t>build</w:t>
-      </w:r>
-      <w:proofErr w:type="spellEnd"/>
-      <w:r>
-        <w:rPr>
-          <w:lang w:val="ru-RU"/>
-        </w:rPr>
-        <w:t xml:space="preserve"> </w:t>
-      </w:r>
-      <w:proofErr w:type="spellStart"/>
-      <w:r>
-        <w:rPr>
-          <w:lang w:val="ru-RU"/>
-        </w:rPr>
-        <w:t>history</w:t>
-      </w:r>
-      <w:proofErr w:type="spellEnd"/>
-      <w:r>
-        <w:rPr>
-          <w:lang w:val="ru-RU"/>
-        </w:rPr>
-        <w:t xml:space="preserve"> и </w:t>
-      </w:r>
-      <w:proofErr w:type="spellStart"/>
-      <w:r>
-        <w:rPr>
-          <w:lang w:val="ru-RU"/>
-        </w:rPr>
-        <w:t>cleanup</w:t>
-      </w:r>
-      <w:proofErr w:type="spellEnd"/>
-      <w:r>
-        <w:rPr>
-          <w:lang w:val="ru-RU"/>
-        </w:rPr>
-        <w:t xml:space="preserve"> выполняются преимущественно через </w:t>
-      </w:r>
-      <w:proofErr w:type="spellStart"/>
-      <w:r>
-        <w:rPr>
-          <w:lang w:val="ru-RU"/>
-        </w:rPr>
-        <w:t>TeamCity</w:t>
-      </w:r>
-      <w:proofErr w:type="spellEnd"/>
-      <w:r>
-        <w:rPr>
-          <w:lang w:val="ru-RU"/>
-        </w:rPr>
-        <w:t xml:space="preserve"> REST API.</w:t>
+        <w:t>Подготовка тестовых данных, создание project/build configuration/VCS root, запуск build, проверка queue/build status/build history и cleanup выполняются через TeamCity REST API. UI используется только для проверки, что подготовленное состояние корректно отображается пользователю.</w:t>
       </w:r>
     </w:p>
     <w:p>
@@ -15926,63 +15151,7 @@
         </w:rPr>
       </w:pPr>
       <w:r>
-        <w:rPr>
-          <w:color w:val="000000"/>
-          <w:lang w:val="ru-RU"/>
-        </w:rPr>
-        <w:t xml:space="preserve">Основная подготовка данных выполняется через </w:t>
-      </w:r>
-      <w:r>
-        <w:rPr>
-          <w:color w:val="000000"/>
-        </w:rPr>
-        <w:t>REST</w:t>
-      </w:r>
-      <w:r>
-        <w:rPr>
-          <w:color w:val="000000"/>
-          <w:lang w:val="ru-RU"/>
-        </w:rPr>
-        <w:t xml:space="preserve"> </w:t>
-      </w:r>
-      <w:r>
-        <w:rPr>
-          <w:color w:val="000000"/>
-        </w:rPr>
-        <w:t>API</w:t>
-      </w:r>
-      <w:r>
-        <w:rPr>
-          <w:color w:val="000000"/>
-          <w:lang w:val="ru-RU"/>
-        </w:rPr>
-        <w:t xml:space="preserve">, </w:t>
-      </w:r>
-      <w:r>
-        <w:rPr>
-          <w:color w:val="000000"/>
-        </w:rPr>
-        <w:t>UI</w:t>
-      </w:r>
-      <w:r>
-        <w:rPr>
-          <w:color w:val="000000"/>
-          <w:lang w:val="ru-RU"/>
-        </w:rPr>
-        <w:t xml:space="preserve"> используется только там, где проверяется сам пользовательский </w:t>
-      </w:r>
-      <w:r>
-        <w:rPr>
-          <w:color w:val="000000"/>
-        </w:rPr>
-        <w:t>flow</w:t>
-      </w:r>
-      <w:r>
-        <w:rPr>
-          <w:color w:val="000000"/>
-          <w:lang w:val="ru-RU"/>
-        </w:rPr>
-        <w:t>.</w:t>
+        <w:t>Все тестовые данные создаются через REST API/bootstrap. UI используется только для одного happy-path read-only flow и не является источником тестовых данных.</w:t>
       </w:r>
     </w:p>
     <w:p>
@@ -16400,71 +15569,8 @@
             <w:vAlign w:val="center"/>
           </w:tcPr>
           <w:p>
-            <w:pPr>
-              <w:spacing w:after="0" w:line="252" w:lineRule="auto"/>
-              <w:rPr>
-                <w:lang w:val="ru-RU"/>
-              </w:rPr>
-            </w:pPr>
-            <w:r>
-              <w:rPr>
-                <w:sz w:val="18"/>
-                <w:szCs w:val="19"/>
-              </w:rPr>
-              <w:t>Setup</w:t>
-            </w:r>
-            <w:r>
-              <w:rPr>
-                <w:sz w:val="18"/>
-                <w:szCs w:val="19"/>
-                <w:lang w:val="ru-RU"/>
-              </w:rPr>
-              <w:t xml:space="preserve"> </w:t>
-            </w:r>
-            <w:r>
-              <w:rPr>
-                <w:sz w:val="18"/>
-                <w:szCs w:val="19"/>
-              </w:rPr>
-              <w:t>wizard</w:t>
-            </w:r>
-            <w:r>
-              <w:rPr>
-                <w:sz w:val="18"/>
-                <w:szCs w:val="19"/>
-                <w:lang w:val="ru-RU"/>
-              </w:rPr>
-              <w:t xml:space="preserve"> + минимальные данные, созданные в самом </w:t>
-            </w:r>
-            <w:r>
-              <w:rPr>
-                <w:sz w:val="18"/>
-                <w:szCs w:val="19"/>
-              </w:rPr>
-              <w:t>UI</w:t>
-            </w:r>
-            <w:r>
-              <w:rPr>
-                <w:sz w:val="18"/>
-                <w:szCs w:val="19"/>
-                <w:lang w:val="ru-RU"/>
-              </w:rPr>
-              <w:t xml:space="preserve"> </w:t>
-            </w:r>
-            <w:r>
-              <w:rPr>
-                <w:sz w:val="18"/>
-                <w:szCs w:val="19"/>
-              </w:rPr>
-              <w:t>flow</w:t>
-            </w:r>
-            <w:r>
-              <w:rPr>
-                <w:sz w:val="18"/>
-                <w:szCs w:val="19"/>
-                <w:lang w:val="ru-RU"/>
-              </w:rPr>
-              <w:t>.</w:t>
+            <w:r>
+              <w:t>Данные заранее создаются через REST API/bootstrap; UI только выполняет один happy-path read-only flow: login, Projects page, Build Configuration/Queue/Build Result.</w:t>
             </w:r>
           </w:p>
         </w:tc>
@@ -16566,24 +15672,8 @@
             <w:vAlign w:val="center"/>
           </w:tcPr>
           <w:p>
-            <w:pPr>
-              <w:spacing w:after="0" w:line="252" w:lineRule="auto"/>
-            </w:pPr>
-            <w:proofErr w:type="spellStart"/>
-            <w:r>
-              <w:rPr>
-                <w:sz w:val="18"/>
-                <w:szCs w:val="19"/>
-              </w:rPr>
-              <w:t>Комбинация</w:t>
-            </w:r>
-            <w:proofErr w:type="spellEnd"/>
-            <w:r>
-              <w:rPr>
-                <w:sz w:val="18"/>
-                <w:szCs w:val="19"/>
-              </w:rPr>
-              <w:t xml:space="preserve"> UI bootstrap + API setup + Docker reset/cleanup.</w:t>
+            <w:r>
+              <w:t>API setup + API build run + read-only UI confirmation; cleanup через REST API или Docker reset.</w:t>
             </w:r>
           </w:p>
         </w:tc>
@@ -17880,31 +16970,8 @@
             <w:vAlign w:val="center"/>
           </w:tcPr>
           <w:p>
-            <w:pPr>
-              <w:spacing w:after="0" w:line="252" w:lineRule="auto"/>
-            </w:pPr>
-            <w:r>
-              <w:rPr>
-                <w:sz w:val="18"/>
-                <w:szCs w:val="19"/>
-              </w:rPr>
-              <w:t xml:space="preserve">Login, Projects page, </w:t>
-            </w:r>
-            <w:proofErr w:type="spellStart"/>
-            <w:r>
-              <w:rPr>
-                <w:sz w:val="18"/>
-                <w:szCs w:val="19"/>
-              </w:rPr>
-              <w:t>переход</w:t>
-            </w:r>
-            <w:proofErr w:type="spellEnd"/>
-            <w:r>
-              <w:rPr>
-                <w:sz w:val="18"/>
-                <w:szCs w:val="19"/>
-              </w:rPr>
-              <w:t xml:space="preserve"> к Build Configuration Settings, Queue/Build Result read-only checks.</w:t>
+            <w:r>
+              <w:t>Один happy path: login, Projects page, переход к заранее созданной через API Build Configuration, Queue/Build Result read-only checks.</w:t>
             </w:r>
           </w:p>
         </w:tc>
@@ -17921,94 +16988,8 @@
             <w:vAlign w:val="center"/>
           </w:tcPr>
           <w:p>
-            <w:pPr>
-              <w:spacing w:after="0" w:line="252" w:lineRule="auto"/>
-              <w:rPr>
-                <w:lang w:val="ru-RU"/>
-              </w:rPr>
-            </w:pPr>
-            <w:r>
-              <w:rPr>
-                <w:sz w:val="18"/>
-                <w:szCs w:val="19"/>
-                <w:lang w:val="ru-RU"/>
-              </w:rPr>
-              <w:t xml:space="preserve">Создание данных через </w:t>
-            </w:r>
-            <w:r>
-              <w:rPr>
-                <w:sz w:val="18"/>
-                <w:szCs w:val="19"/>
-              </w:rPr>
-              <w:t>UI</w:t>
-            </w:r>
-            <w:r>
-              <w:rPr>
-                <w:sz w:val="18"/>
-                <w:szCs w:val="19"/>
-                <w:lang w:val="ru-RU"/>
-              </w:rPr>
-              <w:t xml:space="preserve">, нестабильные длинные </w:t>
-            </w:r>
-            <w:r>
-              <w:rPr>
-                <w:sz w:val="18"/>
-                <w:szCs w:val="19"/>
-              </w:rPr>
-              <w:t>UI</w:t>
-            </w:r>
-            <w:r>
-              <w:rPr>
-                <w:sz w:val="18"/>
-                <w:szCs w:val="19"/>
-                <w:lang w:val="ru-RU"/>
-              </w:rPr>
-              <w:t xml:space="preserve"> </w:t>
-            </w:r>
-            <w:r>
-              <w:rPr>
-                <w:sz w:val="18"/>
-                <w:szCs w:val="19"/>
-              </w:rPr>
-              <w:t>E</w:t>
-            </w:r>
-            <w:r>
-              <w:rPr>
-                <w:sz w:val="18"/>
-                <w:szCs w:val="19"/>
-                <w:lang w:val="ru-RU"/>
-              </w:rPr>
-              <w:t>2</w:t>
-            </w:r>
-            <w:r>
-              <w:rPr>
-                <w:sz w:val="18"/>
-                <w:szCs w:val="19"/>
-              </w:rPr>
-              <w:t>E</w:t>
-            </w:r>
-            <w:r>
-              <w:rPr>
-                <w:sz w:val="18"/>
-                <w:szCs w:val="19"/>
-                <w:lang w:val="ru-RU"/>
-              </w:rPr>
-              <w:t xml:space="preserve"> </w:t>
-            </w:r>
-            <w:r>
-              <w:rPr>
-                <w:sz w:val="18"/>
-                <w:szCs w:val="19"/>
-              </w:rPr>
-              <w:t>flows</w:t>
-            </w:r>
-            <w:r>
-              <w:rPr>
-                <w:sz w:val="18"/>
-                <w:szCs w:val="19"/>
-                <w:lang w:val="ru-RU"/>
-              </w:rPr>
-              <w:t>.</w:t>
+            <w:r>
+              <w:t>Создание данных через UI, редактирование project/build configuration через UI, нестабильные длинные UI E2E flows.</w:t>
             </w:r>
           </w:p>
         </w:tc>
@@ -18460,15 +17441,8 @@
             <w:vAlign w:val="center"/>
           </w:tcPr>
           <w:p>
-            <w:pPr>
-              <w:spacing w:after="0" w:line="252" w:lineRule="auto"/>
-            </w:pPr>
-            <w:r>
-              <w:rPr>
-                <w:sz w:val="18"/>
-                <w:szCs w:val="19"/>
-              </w:rPr>
-              <w:t>Database</w:t>
+            <w:r>
+              <w:t>Database Compatibility</w:t>
             </w:r>
           </w:p>
         </w:tc>
@@ -18485,49 +17459,8 @@
             <w:vAlign w:val="center"/>
           </w:tcPr>
           <w:p>
-            <w:pPr>
-              <w:spacing w:after="0" w:line="252" w:lineRule="auto"/>
-              <w:rPr>
-                <w:lang w:val="ru-RU"/>
-              </w:rPr>
-            </w:pPr>
-            <w:r>
-              <w:rPr>
-                <w:sz w:val="18"/>
-                <w:szCs w:val="19"/>
-                <w:lang w:val="ru-RU"/>
-              </w:rPr>
-              <w:t xml:space="preserve">Только текущая БД стенда как часть </w:t>
-            </w:r>
-            <w:r>
-              <w:rPr>
-                <w:sz w:val="18"/>
-                <w:szCs w:val="19"/>
-              </w:rPr>
-              <w:t>smoke</w:t>
-            </w:r>
-            <w:r>
-              <w:rPr>
-                <w:sz w:val="18"/>
-                <w:szCs w:val="19"/>
-                <w:lang w:val="ru-RU"/>
-              </w:rPr>
-              <w:t>/</w:t>
-            </w:r>
-            <w:r>
-              <w:rPr>
-                <w:sz w:val="18"/>
-                <w:szCs w:val="19"/>
-              </w:rPr>
-              <w:t>readiness</w:t>
-            </w:r>
-            <w:r>
-              <w:rPr>
-                <w:sz w:val="18"/>
-                <w:szCs w:val="19"/>
-                <w:lang w:val="ru-RU"/>
-              </w:rPr>
-              <w:t>.</w:t>
+            <w:r>
+              <w:t>Входит в MVP: PostgreSQL production-like + MySQL/MariaDB/MS SQL/Oracle compatibility regression. Проверяем bootstrap, schema readiness, REST API, agent authorization, project/build configuration, simple build, build result.</w:t>
             </w:r>
           </w:p>
         </w:tc>
@@ -18544,32 +17477,8 @@
             <w:vAlign w:val="center"/>
           </w:tcPr>
           <w:p>
-            <w:pPr>
-              <w:spacing w:after="0" w:line="252" w:lineRule="auto"/>
-              <w:rPr>
-                <w:lang w:val="en-US"/>
-              </w:rPr>
-            </w:pPr>
-            <w:r>
-              <w:rPr>
-                <w:sz w:val="18"/>
-                <w:szCs w:val="19"/>
-              </w:rPr>
-              <w:t>PostgreSQL/MySQL</w:t>
-            </w:r>
-            <w:r>
-              <w:rPr>
-                <w:sz w:val="18"/>
-                <w:szCs w:val="19"/>
-              </w:rPr>
-              <w:t xml:space="preserve"> </w:t>
-            </w:r>
-            <w:r>
-              <w:rPr>
-                <w:sz w:val="18"/>
-                <w:szCs w:val="19"/>
-              </w:rPr>
-              <w:t>/MS SQL/Oracle compatibility regression.</w:t>
+            <w:r>
+              <w:t>Глубокое покрытие всех runners, plugins, build chains и performance/load DB testing на каждой БД; сложные upgrade/migration сценарии.</w:t>
             </w:r>
           </w:p>
         </w:tc>
@@ -19786,57 +18695,8 @@
             <w:vAlign w:val="center"/>
           </w:tcPr>
           <w:p>
-            <w:pPr>
-              <w:spacing w:after="0" w:line="240" w:lineRule="auto"/>
-              <w:rPr>
-                <w:lang w:val="ru-RU"/>
-              </w:rPr>
-            </w:pPr>
-            <w:r>
-              <w:rPr>
-                <w:sz w:val="16"/>
-                <w:lang w:val="ru-RU"/>
-              </w:rPr>
-              <w:t xml:space="preserve">Добавить </w:t>
-            </w:r>
-            <w:r>
-              <w:rPr>
-                <w:sz w:val="16"/>
-              </w:rPr>
-              <w:t>UI</w:t>
-            </w:r>
-            <w:r>
-              <w:rPr>
-                <w:sz w:val="16"/>
-                <w:lang w:val="ru-RU"/>
-              </w:rPr>
-              <w:t xml:space="preserve"> слой во фреймворк и автоматизировать только те пользовательские </w:t>
-            </w:r>
-            <w:r>
-              <w:rPr>
-                <w:sz w:val="16"/>
-              </w:rPr>
-              <w:t>flows</w:t>
-            </w:r>
-            <w:r>
-              <w:rPr>
-                <w:sz w:val="16"/>
-                <w:lang w:val="ru-RU"/>
-              </w:rPr>
-              <w:t xml:space="preserve">, которые нельзя надежно заменить </w:t>
-            </w:r>
-            <w:r>
-              <w:rPr>
-                <w:sz w:val="16"/>
-              </w:rPr>
-              <w:t>API</w:t>
-            </w:r>
-            <w:r>
-              <w:rPr>
-                <w:sz w:val="16"/>
-                <w:lang w:val="ru-RU"/>
-              </w:rPr>
-              <w:t>.</w:t>
+            <w:r>
+              <w:t>Добавить UI слой во фреймворк и автоматизировать один стабильный happy path, который подтверждает, что подготовленные через API данные корректно видны в интерфейсе.</w:t>
             </w:r>
           </w:p>
         </w:tc>
@@ -19846,268 +18706,8 @@
             <w:vAlign w:val="center"/>
           </w:tcPr>
           <w:p>
-            <w:pPr>
-              <w:spacing w:after="0" w:line="240" w:lineRule="auto"/>
-              <w:rPr>
-                <w:lang w:val="ru-RU"/>
-              </w:rPr>
-            </w:pPr>
-            <w:r>
-              <w:rPr>
-                <w:sz w:val="16"/>
-                <w:lang w:val="ru-RU"/>
-              </w:rPr>
-              <w:t xml:space="preserve">Ключевые шаги: добавить </w:t>
-            </w:r>
-            <w:r>
-              <w:rPr>
-                <w:sz w:val="16"/>
-              </w:rPr>
-              <w:t>Playwright</w:t>
-            </w:r>
-            <w:r>
-              <w:rPr>
-                <w:sz w:val="16"/>
-                <w:lang w:val="ru-RU"/>
-              </w:rPr>
-              <w:t xml:space="preserve"> </w:t>
-            </w:r>
-            <w:r>
-              <w:rPr>
-                <w:sz w:val="16"/>
-              </w:rPr>
-              <w:t>layer</w:t>
-            </w:r>
-            <w:r>
-              <w:rPr>
-                <w:sz w:val="16"/>
-                <w:lang w:val="ru-RU"/>
-              </w:rPr>
-              <w:t xml:space="preserve">, </w:t>
-            </w:r>
-            <w:r>
-              <w:rPr>
-                <w:sz w:val="16"/>
-              </w:rPr>
-              <w:t>pages</w:t>
-            </w:r>
-            <w:r>
-              <w:rPr>
-                <w:sz w:val="16"/>
-                <w:lang w:val="ru-RU"/>
-              </w:rPr>
-              <w:t>/</w:t>
-            </w:r>
-            <w:r>
-              <w:rPr>
-                <w:sz w:val="16"/>
-              </w:rPr>
-              <w:t>components</w:t>
-            </w:r>
-            <w:r>
-              <w:rPr>
-                <w:sz w:val="16"/>
-                <w:lang w:val="ru-RU"/>
-              </w:rPr>
-              <w:t xml:space="preserve">, стабильные локаторы и ожидания; настроить </w:t>
-            </w:r>
-            <w:r>
-              <w:rPr>
-                <w:sz w:val="16"/>
-              </w:rPr>
-              <w:t>screenshots</w:t>
-            </w:r>
-            <w:r>
-              <w:rPr>
-                <w:sz w:val="16"/>
-                <w:lang w:val="ru-RU"/>
-              </w:rPr>
-              <w:t>/</w:t>
-            </w:r>
-            <w:r>
-              <w:rPr>
-                <w:sz w:val="16"/>
-              </w:rPr>
-              <w:t>video</w:t>
-            </w:r>
-            <w:r>
-              <w:rPr>
-                <w:sz w:val="16"/>
-                <w:lang w:val="ru-RU"/>
-              </w:rPr>
-              <w:t>/</w:t>
-            </w:r>
-            <w:r>
-              <w:rPr>
-                <w:sz w:val="16"/>
-              </w:rPr>
-              <w:t>trace</w:t>
-            </w:r>
-            <w:r>
-              <w:rPr>
-                <w:sz w:val="16"/>
-                <w:lang w:val="ru-RU"/>
-              </w:rPr>
-              <w:t xml:space="preserve">; реализовать </w:t>
-            </w:r>
-            <w:r>
-              <w:rPr>
-                <w:sz w:val="16"/>
-              </w:rPr>
-              <w:t>UI</w:t>
-            </w:r>
-            <w:r>
-              <w:rPr>
-                <w:sz w:val="16"/>
-                <w:lang w:val="ru-RU"/>
-              </w:rPr>
-              <w:t xml:space="preserve"> </w:t>
-            </w:r>
-            <w:proofErr w:type="spellStart"/>
-            <w:r>
-              <w:rPr>
-                <w:sz w:val="16"/>
-                <w:lang w:val="ru-RU"/>
-              </w:rPr>
-              <w:t>автотесты</w:t>
-            </w:r>
-            <w:proofErr w:type="spellEnd"/>
-            <w:r>
-              <w:rPr>
-                <w:sz w:val="16"/>
-                <w:lang w:val="ru-RU"/>
-              </w:rPr>
-              <w:t xml:space="preserve"> для </w:t>
-            </w:r>
-            <w:r>
-              <w:rPr>
-                <w:sz w:val="16"/>
-              </w:rPr>
-              <w:t>startup</w:t>
-            </w:r>
-            <w:r>
-              <w:rPr>
-                <w:sz w:val="16"/>
-                <w:lang w:val="ru-RU"/>
-              </w:rPr>
-              <w:t xml:space="preserve"> </w:t>
-            </w:r>
-            <w:r>
-              <w:rPr>
-                <w:sz w:val="16"/>
-              </w:rPr>
-              <w:t>confirmation</w:t>
-            </w:r>
-            <w:r>
-              <w:rPr>
-                <w:sz w:val="16"/>
-                <w:lang w:val="ru-RU"/>
-              </w:rPr>
-              <w:t xml:space="preserve">, </w:t>
-            </w:r>
-            <w:r>
-              <w:rPr>
-                <w:sz w:val="16"/>
-              </w:rPr>
-              <w:t>database</w:t>
-            </w:r>
-            <w:r>
-              <w:rPr>
-                <w:sz w:val="16"/>
-                <w:lang w:val="ru-RU"/>
-              </w:rPr>
-              <w:t xml:space="preserve"> </w:t>
-            </w:r>
-            <w:r>
-              <w:rPr>
-                <w:sz w:val="16"/>
-              </w:rPr>
-              <w:t>setup</w:t>
-            </w:r>
-            <w:r>
-              <w:rPr>
-                <w:sz w:val="16"/>
-                <w:lang w:val="ru-RU"/>
-              </w:rPr>
-              <w:t xml:space="preserve">, создания первого администратора, </w:t>
-            </w:r>
-            <w:r>
-              <w:rPr>
-                <w:sz w:val="16"/>
-              </w:rPr>
-              <w:t>login</w:t>
-            </w:r>
-            <w:r>
-              <w:rPr>
-                <w:sz w:val="16"/>
-                <w:lang w:val="ru-RU"/>
-              </w:rPr>
-              <w:t xml:space="preserve"> и </w:t>
-            </w:r>
-            <w:r>
-              <w:rPr>
-                <w:sz w:val="16"/>
-              </w:rPr>
-              <w:t>authorization</w:t>
-            </w:r>
-            <w:r>
-              <w:rPr>
-                <w:sz w:val="16"/>
-                <w:lang w:val="ru-RU"/>
-              </w:rPr>
-              <w:t xml:space="preserve"> </w:t>
-            </w:r>
-            <w:r>
-              <w:rPr>
-                <w:sz w:val="16"/>
-              </w:rPr>
-              <w:t>agent</w:t>
-            </w:r>
-            <w:r>
-              <w:rPr>
-                <w:sz w:val="16"/>
-                <w:lang w:val="ru-RU"/>
-              </w:rPr>
-              <w:t xml:space="preserve">; продолжить параллельную подготовку </w:t>
-            </w:r>
-            <w:r>
-              <w:rPr>
-                <w:sz w:val="16"/>
-              </w:rPr>
-              <w:t>pipeline</w:t>
-            </w:r>
-            <w:r>
-              <w:rPr>
-                <w:sz w:val="16"/>
-                <w:lang w:val="ru-RU"/>
-              </w:rPr>
-              <w:t xml:space="preserve">. Результат: </w:t>
-            </w:r>
-            <w:r>
-              <w:rPr>
-                <w:sz w:val="16"/>
-              </w:rPr>
-              <w:t>UI</w:t>
-            </w:r>
-            <w:r>
-              <w:rPr>
-                <w:sz w:val="16"/>
-                <w:lang w:val="ru-RU"/>
-              </w:rPr>
-              <w:t xml:space="preserve"> </w:t>
-            </w:r>
-            <w:r>
-              <w:rPr>
-                <w:sz w:val="16"/>
-              </w:rPr>
-              <w:t>smoke</w:t>
-            </w:r>
-            <w:r>
-              <w:rPr>
-                <w:sz w:val="16"/>
-                <w:lang w:val="ru-RU"/>
-              </w:rPr>
-              <w:t xml:space="preserve"> покрывает критичный пользовательский путь и дает диагностические артефакты при падениях.</w:t>
+            <w:r>
+              <w:t>Ключевые шаги: добавить Playwright layer, pages/components, стабильные локаторы и ожидания; настроить screenshots/video/trace; реализовать один UI happy path: login, Projects page, переход к заранее созданной через API Build Configuration и read-only проверка Queue/Build Result; продолжить параллельную подготовку pipeline. Результат: UI smoke подтверждает критичный пользовательский путь и дает диагностические артефакты при падениях.</w:t>
             </w:r>
           </w:p>
         </w:tc>
@@ -20255,398 +18855,8 @@
             <w:vAlign w:val="center"/>
           </w:tcPr>
           <w:p>
-            <w:pPr>
-              <w:spacing w:after="0" w:line="240" w:lineRule="auto"/>
-              <w:rPr>
-                <w:lang w:val="ru-RU"/>
-              </w:rPr>
-            </w:pPr>
-            <w:r>
-              <w:rPr>
-                <w:sz w:val="16"/>
-                <w:lang w:val="ru-RU"/>
-              </w:rPr>
-              <w:t xml:space="preserve">Ключевые шаги: настроить </w:t>
-            </w:r>
-            <w:r>
-              <w:rPr>
-                <w:sz w:val="16"/>
-              </w:rPr>
-              <w:t>bootstrap</w:t>
-            </w:r>
-            <w:r>
-              <w:rPr>
-                <w:sz w:val="16"/>
-                <w:lang w:val="ru-RU"/>
-              </w:rPr>
-              <w:t xml:space="preserve"> </w:t>
-            </w:r>
-            <w:r>
-              <w:rPr>
-                <w:sz w:val="16"/>
-              </w:rPr>
-              <w:t>TeamCity</w:t>
-            </w:r>
-            <w:r>
-              <w:rPr>
-                <w:sz w:val="16"/>
-                <w:lang w:val="ru-RU"/>
-              </w:rPr>
-              <w:t xml:space="preserve"> стенда; запуск </w:t>
-            </w:r>
-            <w:r>
-              <w:rPr>
-                <w:sz w:val="16"/>
-              </w:rPr>
-              <w:t>API</w:t>
-            </w:r>
-            <w:r>
-              <w:rPr>
-                <w:sz w:val="16"/>
-                <w:lang w:val="ru-RU"/>
-              </w:rPr>
-              <w:t>/</w:t>
-            </w:r>
-            <w:r>
-              <w:rPr>
-                <w:sz w:val="16"/>
-              </w:rPr>
-              <w:t>UI</w:t>
-            </w:r>
-            <w:r>
-              <w:rPr>
-                <w:sz w:val="16"/>
-                <w:lang w:val="ru-RU"/>
-              </w:rPr>
-              <w:t>/</w:t>
-            </w:r>
-            <w:r>
-              <w:rPr>
-                <w:sz w:val="16"/>
-              </w:rPr>
-              <w:t>E</w:t>
-            </w:r>
-            <w:r>
-              <w:rPr>
-                <w:sz w:val="16"/>
-                <w:lang w:val="ru-RU"/>
-              </w:rPr>
-              <w:t>2</w:t>
-            </w:r>
-            <w:r>
-              <w:rPr>
-                <w:sz w:val="16"/>
-              </w:rPr>
-              <w:t>E</w:t>
-            </w:r>
-            <w:r>
-              <w:rPr>
-                <w:sz w:val="16"/>
-                <w:lang w:val="ru-RU"/>
-              </w:rPr>
-              <w:t xml:space="preserve"> </w:t>
-            </w:r>
-            <w:r>
-              <w:rPr>
-                <w:sz w:val="16"/>
-              </w:rPr>
-              <w:t>suites</w:t>
-            </w:r>
-            <w:r>
-              <w:rPr>
-                <w:sz w:val="16"/>
-                <w:lang w:val="ru-RU"/>
-              </w:rPr>
-              <w:t xml:space="preserve">; публикацию </w:t>
-            </w:r>
-            <w:r>
-              <w:rPr>
-                <w:sz w:val="16"/>
-              </w:rPr>
-              <w:t>Allure</w:t>
-            </w:r>
-            <w:r>
-              <w:rPr>
-                <w:sz w:val="16"/>
-                <w:lang w:val="ru-RU"/>
-              </w:rPr>
-              <w:t xml:space="preserve"> </w:t>
-            </w:r>
-            <w:r>
-              <w:rPr>
-                <w:sz w:val="16"/>
-              </w:rPr>
-              <w:t>Report</w:t>
-            </w:r>
-            <w:r>
-              <w:rPr>
-                <w:sz w:val="16"/>
-                <w:lang w:val="ru-RU"/>
-              </w:rPr>
-              <w:t xml:space="preserve">; сбор метрик </w:t>
-            </w:r>
-            <w:r>
-              <w:rPr>
-                <w:sz w:val="16"/>
-              </w:rPr>
-              <w:t>pass</w:t>
-            </w:r>
-            <w:r>
-              <w:rPr>
-                <w:sz w:val="16"/>
-                <w:lang w:val="ru-RU"/>
-              </w:rPr>
-              <w:t xml:space="preserve"> </w:t>
-            </w:r>
-            <w:r>
-              <w:rPr>
-                <w:sz w:val="16"/>
-              </w:rPr>
-              <w:t>rate</w:t>
-            </w:r>
-            <w:r>
-              <w:rPr>
-                <w:sz w:val="16"/>
-                <w:lang w:val="ru-RU"/>
-              </w:rPr>
-              <w:t xml:space="preserve">, </w:t>
-            </w:r>
-            <w:r>
-              <w:rPr>
-                <w:sz w:val="16"/>
-              </w:rPr>
-              <w:t>fail</w:t>
-            </w:r>
-            <w:r>
-              <w:rPr>
-                <w:sz w:val="16"/>
-                <w:lang w:val="ru-RU"/>
-              </w:rPr>
-              <w:t xml:space="preserve"> </w:t>
-            </w:r>
-            <w:r>
-              <w:rPr>
-                <w:sz w:val="16"/>
-              </w:rPr>
-              <w:t>rate</w:t>
-            </w:r>
-            <w:r>
-              <w:rPr>
-                <w:sz w:val="16"/>
-                <w:lang w:val="ru-RU"/>
-              </w:rPr>
-              <w:t xml:space="preserve">, </w:t>
-            </w:r>
-            <w:r>
-              <w:rPr>
-                <w:sz w:val="16"/>
-              </w:rPr>
-              <w:t>duration</w:t>
-            </w:r>
-            <w:r>
-              <w:rPr>
-                <w:sz w:val="16"/>
-                <w:lang w:val="ru-RU"/>
-              </w:rPr>
-              <w:t xml:space="preserve">, </w:t>
-            </w:r>
-            <w:r>
-              <w:rPr>
-                <w:sz w:val="16"/>
-              </w:rPr>
-              <w:t>flaky</w:t>
-            </w:r>
-            <w:r>
-              <w:rPr>
-                <w:sz w:val="16"/>
-                <w:lang w:val="ru-RU"/>
-              </w:rPr>
-              <w:t xml:space="preserve"> </w:t>
-            </w:r>
-            <w:r>
-              <w:rPr>
-                <w:sz w:val="16"/>
-              </w:rPr>
-              <w:t>failures</w:t>
-            </w:r>
-            <w:r>
-              <w:rPr>
-                <w:sz w:val="16"/>
-                <w:lang w:val="ru-RU"/>
-              </w:rPr>
-              <w:t xml:space="preserve">, </w:t>
-            </w:r>
-            <w:r>
-              <w:rPr>
-                <w:sz w:val="16"/>
-              </w:rPr>
-              <w:t>failed</w:t>
-            </w:r>
-            <w:r>
-              <w:rPr>
-                <w:sz w:val="16"/>
-                <w:lang w:val="ru-RU"/>
-              </w:rPr>
-              <w:t>/</w:t>
-            </w:r>
-            <w:r>
-              <w:rPr>
-                <w:sz w:val="16"/>
-              </w:rPr>
-              <w:t>skipped</w:t>
-            </w:r>
-            <w:r>
-              <w:rPr>
-                <w:sz w:val="16"/>
-                <w:lang w:val="ru-RU"/>
-              </w:rPr>
-              <w:t xml:space="preserve"> </w:t>
-            </w:r>
-            <w:r>
-              <w:rPr>
-                <w:sz w:val="16"/>
-              </w:rPr>
-              <w:t>tests</w:t>
-            </w:r>
-            <w:r>
-              <w:rPr>
-                <w:sz w:val="16"/>
-                <w:lang w:val="ru-RU"/>
-              </w:rPr>
-              <w:t xml:space="preserve">; </w:t>
-            </w:r>
-            <w:r>
-              <w:rPr>
-                <w:sz w:val="16"/>
-              </w:rPr>
-              <w:t>quality</w:t>
-            </w:r>
-            <w:r>
-              <w:rPr>
-                <w:sz w:val="16"/>
-                <w:lang w:val="ru-RU"/>
-              </w:rPr>
-              <w:t xml:space="preserve"> </w:t>
-            </w:r>
-            <w:r>
-              <w:rPr>
-                <w:sz w:val="16"/>
-              </w:rPr>
-              <w:t>gates</w:t>
-            </w:r>
-            <w:r>
-              <w:rPr>
-                <w:sz w:val="16"/>
-                <w:lang w:val="ru-RU"/>
-              </w:rPr>
-              <w:t xml:space="preserve"> </w:t>
-            </w:r>
-            <w:proofErr w:type="spellStart"/>
-            <w:r>
-              <w:rPr>
-                <w:sz w:val="16"/>
-                <w:lang w:val="ru-RU"/>
-              </w:rPr>
-              <w:t>автотестов</w:t>
-            </w:r>
-            <w:proofErr w:type="spellEnd"/>
-            <w:r>
-              <w:rPr>
-                <w:sz w:val="16"/>
-                <w:lang w:val="ru-RU"/>
-              </w:rPr>
-              <w:t xml:space="preserve">; </w:t>
-            </w:r>
-            <w:r>
-              <w:rPr>
-                <w:sz w:val="16"/>
-              </w:rPr>
-              <w:t>Telegram</w:t>
-            </w:r>
-            <w:r>
-              <w:rPr>
-                <w:sz w:val="16"/>
-                <w:lang w:val="ru-RU"/>
-              </w:rPr>
-              <w:t xml:space="preserve"> </w:t>
-            </w:r>
-            <w:r>
-              <w:rPr>
-                <w:sz w:val="16"/>
-              </w:rPr>
-              <w:t>bot</w:t>
-            </w:r>
-            <w:r>
-              <w:rPr>
-                <w:sz w:val="16"/>
-                <w:lang w:val="ru-RU"/>
-              </w:rPr>
-              <w:t xml:space="preserve"> уведомления со статусом прогона, ссылкой на отчет и списком критичных падений; стабилизацию </w:t>
-            </w:r>
-            <w:r>
-              <w:rPr>
-                <w:sz w:val="16"/>
-              </w:rPr>
-              <w:t>flaky</w:t>
-            </w:r>
-            <w:r>
-              <w:rPr>
-                <w:sz w:val="16"/>
-                <w:lang w:val="ru-RU"/>
-              </w:rPr>
-              <w:t xml:space="preserve"> тестов. Результат: готов </w:t>
-            </w:r>
-            <w:r>
-              <w:rPr>
-                <w:sz w:val="16"/>
-              </w:rPr>
-              <w:t>demo</w:t>
-            </w:r>
-            <w:r>
-              <w:rPr>
-                <w:sz w:val="16"/>
-                <w:lang w:val="ru-RU"/>
-              </w:rPr>
-              <w:t xml:space="preserve">-прогон </w:t>
-            </w:r>
-            <w:r>
-              <w:rPr>
-                <w:sz w:val="16"/>
-              </w:rPr>
-              <w:t>MVP</w:t>
-            </w:r>
-            <w:r>
-              <w:rPr>
-                <w:sz w:val="16"/>
-                <w:lang w:val="ru-RU"/>
-              </w:rPr>
-              <w:t xml:space="preserve"> автоматизации в </w:t>
-            </w:r>
-            <w:r>
-              <w:rPr>
-                <w:sz w:val="16"/>
-              </w:rPr>
-              <w:t>CI</w:t>
-            </w:r>
-            <w:r>
-              <w:rPr>
-                <w:sz w:val="16"/>
-                <w:lang w:val="ru-RU"/>
-              </w:rPr>
-              <w:t>/</w:t>
-            </w:r>
-            <w:r>
-              <w:rPr>
-                <w:sz w:val="16"/>
-              </w:rPr>
-              <w:t>CD</w:t>
-            </w:r>
-            <w:r>
-              <w:rPr>
-                <w:sz w:val="16"/>
-                <w:lang w:val="ru-RU"/>
-              </w:rPr>
-              <w:t>.</w:t>
+            <w:r>
+              <w:t>Ключевые шаги: настроить bootstrap TeamCity стенда; запуск API/UI/E2E suites; добавить DB compatibility jobs для PostgreSQL/MySQL/MariaDB/MS SQL/Oracle; публикацию Allure Report; сбор метрик pass rate, fail rate, duration, flaky failures, failed/skipped tests; quality gates автотестов; Telegram bot уведомления со статусом прогона, ссылкой на отчет и списком критичных падений; стабилизацию flaky тестов. Результат: готов demo-прогон MVP автоматизации в CI/CD.</w:t>
             </w:r>
           </w:p>
         </w:tc>
@@ -21649,216 +19859,8 @@
             <w:vAlign w:val="center"/>
           </w:tcPr>
           <w:p>
-            <w:pPr>
-              <w:spacing w:after="0" w:line="240" w:lineRule="auto"/>
-              <w:rPr>
-                <w:lang w:val="ru-RU"/>
-              </w:rPr>
-            </w:pPr>
-            <w:r>
-              <w:rPr>
-                <w:sz w:val="17"/>
-                <w:lang w:val="ru-RU"/>
-              </w:rPr>
-              <w:t xml:space="preserve">Реализованы </w:t>
-            </w:r>
-            <w:r>
-              <w:rPr>
-                <w:sz w:val="17"/>
-              </w:rPr>
-              <w:t>UI</w:t>
-            </w:r>
-            <w:r>
-              <w:rPr>
-                <w:sz w:val="17"/>
-                <w:lang w:val="ru-RU"/>
-              </w:rPr>
-              <w:t xml:space="preserve"> </w:t>
-            </w:r>
-            <w:proofErr w:type="spellStart"/>
-            <w:r>
-              <w:rPr>
-                <w:sz w:val="17"/>
-                <w:lang w:val="ru-RU"/>
-              </w:rPr>
-              <w:t>автотесты</w:t>
-            </w:r>
-            <w:proofErr w:type="spellEnd"/>
-            <w:r>
-              <w:rPr>
-                <w:sz w:val="17"/>
-                <w:lang w:val="ru-RU"/>
-              </w:rPr>
-              <w:t xml:space="preserve"> только для критичных пользовательских </w:t>
-            </w:r>
-            <w:r>
-              <w:rPr>
-                <w:sz w:val="17"/>
-              </w:rPr>
-              <w:t>flows</w:t>
-            </w:r>
-            <w:r>
-              <w:rPr>
-                <w:sz w:val="17"/>
-                <w:lang w:val="ru-RU"/>
-              </w:rPr>
-              <w:t xml:space="preserve">, которые нельзя надежно заменить </w:t>
-            </w:r>
-            <w:r>
-              <w:rPr>
-                <w:sz w:val="17"/>
-              </w:rPr>
-              <w:t>API</w:t>
-            </w:r>
-            <w:r>
-              <w:rPr>
-                <w:sz w:val="17"/>
-                <w:lang w:val="ru-RU"/>
-              </w:rPr>
-              <w:t xml:space="preserve">: </w:t>
-            </w:r>
-            <w:r>
-              <w:rPr>
-                <w:sz w:val="17"/>
-              </w:rPr>
-              <w:t>startup</w:t>
-            </w:r>
-            <w:r>
-              <w:rPr>
-                <w:sz w:val="17"/>
-                <w:lang w:val="ru-RU"/>
-              </w:rPr>
-              <w:t xml:space="preserve"> </w:t>
-            </w:r>
-            <w:r>
-              <w:rPr>
-                <w:sz w:val="17"/>
-              </w:rPr>
-              <w:t>confirmation</w:t>
-            </w:r>
-            <w:r>
-              <w:rPr>
-                <w:sz w:val="17"/>
-                <w:lang w:val="ru-RU"/>
-              </w:rPr>
-              <w:t xml:space="preserve">, </w:t>
-            </w:r>
-            <w:r>
-              <w:rPr>
-                <w:sz w:val="17"/>
-              </w:rPr>
-              <w:t>database</w:t>
-            </w:r>
-            <w:r>
-              <w:rPr>
-                <w:sz w:val="17"/>
-                <w:lang w:val="ru-RU"/>
-              </w:rPr>
-              <w:t xml:space="preserve"> </w:t>
-            </w:r>
-            <w:r>
-              <w:rPr>
-                <w:sz w:val="17"/>
-              </w:rPr>
-              <w:t>setup</w:t>
-            </w:r>
-            <w:r>
-              <w:rPr>
-                <w:sz w:val="17"/>
-                <w:lang w:val="ru-RU"/>
-              </w:rPr>
-              <w:t xml:space="preserve">, создание первого администратора, </w:t>
-            </w:r>
-            <w:r>
-              <w:rPr>
-                <w:sz w:val="17"/>
-              </w:rPr>
-              <w:t>login</w:t>
-            </w:r>
-            <w:r>
-              <w:rPr>
-                <w:sz w:val="17"/>
-                <w:lang w:val="ru-RU"/>
-              </w:rPr>
-              <w:t xml:space="preserve">, </w:t>
-            </w:r>
-            <w:r>
-              <w:rPr>
-                <w:sz w:val="17"/>
-              </w:rPr>
-              <w:t>authorization</w:t>
-            </w:r>
-            <w:r>
-              <w:rPr>
-                <w:sz w:val="17"/>
-                <w:lang w:val="ru-RU"/>
-              </w:rPr>
-              <w:t xml:space="preserve"> </w:t>
-            </w:r>
-            <w:r>
-              <w:rPr>
-                <w:sz w:val="17"/>
-              </w:rPr>
-              <w:t>agent</w:t>
-            </w:r>
-            <w:r>
-              <w:rPr>
-                <w:sz w:val="17"/>
-                <w:lang w:val="ru-RU"/>
-              </w:rPr>
-              <w:t xml:space="preserve">. Для </w:t>
-            </w:r>
-            <w:r>
-              <w:rPr>
-                <w:sz w:val="17"/>
-              </w:rPr>
-              <w:t>UI</w:t>
-            </w:r>
-            <w:r>
-              <w:rPr>
-                <w:sz w:val="17"/>
-                <w:lang w:val="ru-RU"/>
-              </w:rPr>
-              <w:t xml:space="preserve">-тестов настроены стабильные локаторы, ожидания, </w:t>
-            </w:r>
-            <w:r>
-              <w:rPr>
-                <w:sz w:val="17"/>
-              </w:rPr>
-              <w:t>screenshots</w:t>
-            </w:r>
-            <w:r>
-              <w:rPr>
-                <w:sz w:val="17"/>
-                <w:lang w:val="ru-RU"/>
-              </w:rPr>
-              <w:t>/</w:t>
-            </w:r>
-            <w:r>
-              <w:rPr>
-                <w:sz w:val="17"/>
-              </w:rPr>
-              <w:t>video</w:t>
-            </w:r>
-            <w:r>
-              <w:rPr>
-                <w:sz w:val="17"/>
-                <w:lang w:val="ru-RU"/>
-              </w:rPr>
-              <w:t>/</w:t>
-            </w:r>
-            <w:r>
-              <w:rPr>
-                <w:sz w:val="17"/>
-              </w:rPr>
-              <w:t>trace</w:t>
-            </w:r>
-            <w:r>
-              <w:rPr>
-                <w:sz w:val="17"/>
-                <w:lang w:val="ru-RU"/>
-              </w:rPr>
-              <w:t xml:space="preserve"> для разбора падений.</w:t>
+            <w:r>
+              <w:t>Реализован один UI happy path, который не создает тестовые данные: login, Projects page, переход к заранее созданной через API Build Configuration, read-only проверка Queue/Build Result. Для UI-теста настроены стабильные локаторы, ожидания, screenshots/video/trace для разбора падений.</w:t>
             </w:r>
           </w:p>
         </w:tc>
@@ -21964,332 +19966,8 @@
             <w:vAlign w:val="center"/>
           </w:tcPr>
           <w:p>
-            <w:pPr>
-              <w:spacing w:after="0" w:line="240" w:lineRule="auto"/>
-              <w:rPr>
-                <w:lang w:val="ru-RU"/>
-              </w:rPr>
-            </w:pPr>
-            <w:r>
-              <w:rPr>
-                <w:sz w:val="17"/>
-                <w:lang w:val="ru-RU"/>
-              </w:rPr>
-              <w:t xml:space="preserve">Настроен </w:t>
-            </w:r>
-            <w:r>
-              <w:rPr>
-                <w:sz w:val="17"/>
-              </w:rPr>
-              <w:t>pipeline</w:t>
-            </w:r>
-            <w:r>
-              <w:rPr>
-                <w:sz w:val="17"/>
-                <w:lang w:val="ru-RU"/>
-              </w:rPr>
-              <w:t xml:space="preserve">, который поднимает </w:t>
-            </w:r>
-            <w:r>
-              <w:rPr>
-                <w:sz w:val="17"/>
-              </w:rPr>
-              <w:t>TeamCity</w:t>
-            </w:r>
-            <w:r>
-              <w:rPr>
-                <w:sz w:val="17"/>
-                <w:lang w:val="ru-RU"/>
-              </w:rPr>
-              <w:t xml:space="preserve"> стенд, выполняет </w:t>
-            </w:r>
-            <w:r>
-              <w:rPr>
-                <w:sz w:val="17"/>
-              </w:rPr>
-              <w:t>bootstrap</w:t>
-            </w:r>
-            <w:r>
-              <w:rPr>
-                <w:sz w:val="17"/>
-                <w:lang w:val="ru-RU"/>
-              </w:rPr>
-              <w:t xml:space="preserve">, запускает </w:t>
-            </w:r>
-            <w:r>
-              <w:rPr>
-                <w:sz w:val="17"/>
-              </w:rPr>
-              <w:t>API</w:t>
-            </w:r>
-            <w:r>
-              <w:rPr>
-                <w:sz w:val="17"/>
-                <w:lang w:val="ru-RU"/>
-              </w:rPr>
-              <w:t>/</w:t>
-            </w:r>
-            <w:r>
-              <w:rPr>
-                <w:sz w:val="17"/>
-              </w:rPr>
-              <w:t>UI</w:t>
-            </w:r>
-            <w:r>
-              <w:rPr>
-                <w:sz w:val="17"/>
-                <w:lang w:val="ru-RU"/>
-              </w:rPr>
-              <w:t>/</w:t>
-            </w:r>
-            <w:r>
-              <w:rPr>
-                <w:sz w:val="17"/>
-              </w:rPr>
-              <w:t>E</w:t>
-            </w:r>
-            <w:r>
-              <w:rPr>
-                <w:sz w:val="17"/>
-                <w:lang w:val="ru-RU"/>
-              </w:rPr>
-              <w:t>2</w:t>
-            </w:r>
-            <w:r>
-              <w:rPr>
-                <w:sz w:val="17"/>
-              </w:rPr>
-              <w:t>E</w:t>
-            </w:r>
-            <w:r>
-              <w:rPr>
-                <w:sz w:val="17"/>
-                <w:lang w:val="ru-RU"/>
-              </w:rPr>
-              <w:t xml:space="preserve"> </w:t>
-            </w:r>
-            <w:proofErr w:type="spellStart"/>
-            <w:r>
-              <w:rPr>
-                <w:sz w:val="17"/>
-                <w:lang w:val="ru-RU"/>
-              </w:rPr>
-              <w:t>автотесты</w:t>
-            </w:r>
-            <w:proofErr w:type="spellEnd"/>
-            <w:r>
-              <w:rPr>
-                <w:sz w:val="17"/>
-                <w:lang w:val="ru-RU"/>
-              </w:rPr>
-              <w:t xml:space="preserve"> и публикует результаты. </w:t>
-            </w:r>
-            <w:proofErr w:type="spellStart"/>
-            <w:r>
-              <w:rPr>
-                <w:sz w:val="17"/>
-              </w:rPr>
-              <w:t>Подключен</w:t>
-            </w:r>
-            <w:proofErr w:type="spellEnd"/>
-            <w:r>
-              <w:rPr>
-                <w:sz w:val="17"/>
-              </w:rPr>
-              <w:t xml:space="preserve"> Allure Report с </w:t>
-            </w:r>
-            <w:proofErr w:type="spellStart"/>
-            <w:r>
-              <w:rPr>
-                <w:sz w:val="17"/>
-              </w:rPr>
-              <w:t>метриками</w:t>
-            </w:r>
-            <w:proofErr w:type="spellEnd"/>
-            <w:r>
-              <w:rPr>
-                <w:sz w:val="17"/>
-              </w:rPr>
-              <w:t xml:space="preserve"> pass rate, fail rate, duration, flaky failures, failed tests и skipped tests. </w:t>
-            </w:r>
-            <w:r>
-              <w:rPr>
-                <w:sz w:val="17"/>
-                <w:lang w:val="ru-RU"/>
-              </w:rPr>
-              <w:t xml:space="preserve">Настроены </w:t>
-            </w:r>
-            <w:r>
-              <w:rPr>
-                <w:sz w:val="17"/>
-              </w:rPr>
-              <w:t>quality</w:t>
-            </w:r>
-            <w:r>
-              <w:rPr>
-                <w:sz w:val="17"/>
-                <w:lang w:val="ru-RU"/>
-              </w:rPr>
-              <w:t xml:space="preserve"> </w:t>
-            </w:r>
-            <w:r>
-              <w:rPr>
-                <w:sz w:val="17"/>
-              </w:rPr>
-              <w:t>gates</w:t>
-            </w:r>
-            <w:r>
-              <w:rPr>
-                <w:sz w:val="17"/>
-                <w:lang w:val="ru-RU"/>
-              </w:rPr>
-              <w:t xml:space="preserve"> </w:t>
-            </w:r>
-            <w:proofErr w:type="spellStart"/>
-            <w:r>
-              <w:rPr>
-                <w:sz w:val="17"/>
-                <w:lang w:val="ru-RU"/>
-              </w:rPr>
-              <w:t>автотестов</w:t>
-            </w:r>
-            <w:proofErr w:type="spellEnd"/>
-            <w:r>
-              <w:rPr>
-                <w:sz w:val="17"/>
-                <w:lang w:val="ru-RU"/>
-              </w:rPr>
-              <w:t xml:space="preserve">: </w:t>
-            </w:r>
-            <w:r>
-              <w:rPr>
-                <w:sz w:val="17"/>
-              </w:rPr>
-              <w:t>pipeline</w:t>
-            </w:r>
-            <w:r>
-              <w:rPr>
-                <w:sz w:val="17"/>
-                <w:lang w:val="ru-RU"/>
-              </w:rPr>
-              <w:t xml:space="preserve"> не считается успешным, если падают критичные </w:t>
-            </w:r>
-            <w:r>
-              <w:rPr>
-                <w:sz w:val="17"/>
-              </w:rPr>
-              <w:t>P</w:t>
-            </w:r>
-            <w:r>
-              <w:rPr>
-                <w:sz w:val="17"/>
-                <w:lang w:val="ru-RU"/>
-              </w:rPr>
-              <w:t>0/</w:t>
-            </w:r>
-            <w:r>
-              <w:rPr>
-                <w:sz w:val="17"/>
-              </w:rPr>
-              <w:t>P</w:t>
-            </w:r>
-            <w:r>
-              <w:rPr>
-                <w:sz w:val="17"/>
-                <w:lang w:val="ru-RU"/>
-              </w:rPr>
-              <w:t xml:space="preserve">1 проверки или </w:t>
-            </w:r>
-            <w:r>
-              <w:rPr>
-                <w:sz w:val="17"/>
-              </w:rPr>
-              <w:t>pass</w:t>
-            </w:r>
-            <w:r>
-              <w:rPr>
-                <w:sz w:val="17"/>
-                <w:lang w:val="ru-RU"/>
-              </w:rPr>
-              <w:t xml:space="preserve"> </w:t>
-            </w:r>
-            <w:r>
-              <w:rPr>
-                <w:sz w:val="17"/>
-              </w:rPr>
-              <w:t>rate</w:t>
-            </w:r>
-            <w:r>
-              <w:rPr>
-                <w:sz w:val="17"/>
-                <w:lang w:val="ru-RU"/>
-              </w:rPr>
-              <w:t xml:space="preserve"> ниже заданного порога. Добавлены уведомления в </w:t>
-            </w:r>
-            <w:r>
-              <w:rPr>
-                <w:sz w:val="17"/>
-              </w:rPr>
-              <w:t>Telegram</w:t>
-            </w:r>
-            <w:r>
-              <w:rPr>
-                <w:sz w:val="17"/>
-                <w:lang w:val="ru-RU"/>
-              </w:rPr>
-              <w:t xml:space="preserve"> через </w:t>
-            </w:r>
-            <w:r>
-              <w:rPr>
-                <w:sz w:val="17"/>
-              </w:rPr>
-              <w:t>bot</w:t>
-            </w:r>
-            <w:r>
-              <w:rPr>
-                <w:sz w:val="17"/>
-                <w:lang w:val="ru-RU"/>
-              </w:rPr>
-              <w:t xml:space="preserve">: статус прогона, ссылка на отчет, </w:t>
-            </w:r>
-            <w:r>
-              <w:rPr>
-                <w:sz w:val="17"/>
-              </w:rPr>
-              <w:t>passed</w:t>
-            </w:r>
-            <w:r>
-              <w:rPr>
-                <w:sz w:val="17"/>
-                <w:lang w:val="ru-RU"/>
-              </w:rPr>
-              <w:t>/</w:t>
-            </w:r>
-            <w:r>
-              <w:rPr>
-                <w:sz w:val="17"/>
-              </w:rPr>
-              <w:t>failed</w:t>
-            </w:r>
-            <w:r>
-              <w:rPr>
-                <w:sz w:val="17"/>
-                <w:lang w:val="ru-RU"/>
-              </w:rPr>
-              <w:t>/</w:t>
-            </w:r>
-            <w:r>
-              <w:rPr>
-                <w:sz w:val="17"/>
-              </w:rPr>
-              <w:t>skipped</w:t>
-            </w:r>
-            <w:r>
-              <w:rPr>
-                <w:sz w:val="17"/>
-                <w:lang w:val="ru-RU"/>
-              </w:rPr>
-              <w:t xml:space="preserve"> и список критичных падений.</w:t>
+            <w:r>
+              <w:t>Настроен pipeline, который поднимает TeamCity стенд, выполняет bootstrap, запускает API/UI/E2E автотесты и DB compatibility jobs для PostgreSQL/MySQL/MariaDB/MS SQL/Oracle, затем публикует результаты. Подключен Allure Report с метриками pass rate, fail rate, duration, flaky failures, failed tests и skipped tests. Настроены quality gates автотестов: pipeline не считается успешным, если падают критичные P0/P1 проверки, DB compatibility checks или pass rate ниже заданного порога. Добавлены уведомления в Telegram через bot: статус прогона, ссылка на отчет, passed/failed/skipped и список критичных падений.</w:t>
             </w:r>
           </w:p>
         </w:tc>
@@ -22886,252 +20564,8 @@
             <w:vAlign w:val="center"/>
           </w:tcPr>
           <w:p>
-            <w:pPr>
-              <w:spacing w:after="0" w:line="240" w:lineRule="auto"/>
-              <w:rPr>
-                <w:lang w:val="ru-RU"/>
-              </w:rPr>
-            </w:pPr>
-            <w:r>
-              <w:rPr>
-                <w:sz w:val="17"/>
-                <w:lang w:val="ru-RU"/>
-              </w:rPr>
-              <w:t xml:space="preserve">Оставить </w:t>
-            </w:r>
-            <w:r>
-              <w:rPr>
-                <w:sz w:val="17"/>
-              </w:rPr>
-              <w:t>HSQLDB</w:t>
-            </w:r>
-            <w:r>
-              <w:rPr>
-                <w:sz w:val="17"/>
-                <w:lang w:val="ru-RU"/>
-              </w:rPr>
-              <w:t xml:space="preserve"> для быстрого </w:t>
-            </w:r>
-            <w:r>
-              <w:rPr>
-                <w:sz w:val="17"/>
-              </w:rPr>
-              <w:t>PR</w:t>
-            </w:r>
-            <w:r>
-              <w:rPr>
-                <w:sz w:val="17"/>
-                <w:lang w:val="ru-RU"/>
-              </w:rPr>
-              <w:t>-контур</w:t>
-            </w:r>
-            <w:r>
-              <w:rPr>
-                <w:sz w:val="17"/>
-              </w:rPr>
-              <w:t>a</w:t>
-            </w:r>
-            <w:r>
-              <w:rPr>
-                <w:sz w:val="17"/>
-                <w:lang w:val="ru-RU"/>
-              </w:rPr>
-              <w:t xml:space="preserve">, добавить </w:t>
-            </w:r>
-            <w:r>
-              <w:rPr>
-                <w:sz w:val="17"/>
-              </w:rPr>
-              <w:t>PostgreSQL</w:t>
-            </w:r>
-            <w:r>
-              <w:rPr>
-                <w:sz w:val="17"/>
-                <w:lang w:val="ru-RU"/>
-              </w:rPr>
-              <w:t xml:space="preserve"> </w:t>
-            </w:r>
-            <w:r>
-              <w:rPr>
-                <w:sz w:val="17"/>
-              </w:rPr>
-              <w:t>production</w:t>
-            </w:r>
-            <w:r>
-              <w:rPr>
-                <w:sz w:val="17"/>
-                <w:lang w:val="ru-RU"/>
-              </w:rPr>
-              <w:t>-</w:t>
-            </w:r>
-            <w:r>
-              <w:rPr>
-                <w:sz w:val="17"/>
-              </w:rPr>
-              <w:t>like</w:t>
-            </w:r>
-            <w:r>
-              <w:rPr>
-                <w:sz w:val="17"/>
-                <w:lang w:val="ru-RU"/>
-              </w:rPr>
-              <w:t xml:space="preserve"> </w:t>
-            </w:r>
-            <w:r>
-              <w:rPr>
-                <w:sz w:val="17"/>
-              </w:rPr>
-              <w:t>job</w:t>
-            </w:r>
-            <w:r>
-              <w:rPr>
-                <w:sz w:val="17"/>
-                <w:lang w:val="ru-RU"/>
-              </w:rPr>
-              <w:t xml:space="preserve"> на </w:t>
-            </w:r>
-            <w:r>
-              <w:rPr>
-                <w:sz w:val="17"/>
-              </w:rPr>
-              <w:t>main</w:t>
-            </w:r>
-            <w:r>
-              <w:rPr>
-                <w:sz w:val="17"/>
-                <w:lang w:val="ru-RU"/>
-              </w:rPr>
-              <w:t>/</w:t>
-            </w:r>
-            <w:r>
-              <w:rPr>
-                <w:sz w:val="17"/>
-              </w:rPr>
-              <w:t>release</w:t>
-            </w:r>
-            <w:r>
-              <w:rPr>
-                <w:sz w:val="17"/>
-                <w:lang w:val="ru-RU"/>
-              </w:rPr>
-              <w:t xml:space="preserve"> и </w:t>
-            </w:r>
-            <w:r>
-              <w:rPr>
-                <w:sz w:val="17"/>
-              </w:rPr>
-              <w:t>nightly</w:t>
-            </w:r>
-            <w:r>
-              <w:rPr>
-                <w:sz w:val="17"/>
-                <w:lang w:val="ru-RU"/>
-              </w:rPr>
-              <w:t xml:space="preserve"> </w:t>
-            </w:r>
-            <w:r>
-              <w:rPr>
-                <w:sz w:val="17"/>
-              </w:rPr>
-              <w:t>compatibility</w:t>
-            </w:r>
-            <w:r>
-              <w:rPr>
-                <w:sz w:val="17"/>
-                <w:lang w:val="ru-RU"/>
-              </w:rPr>
-              <w:t xml:space="preserve"> </w:t>
-            </w:r>
-            <w:r>
-              <w:rPr>
-                <w:sz w:val="17"/>
-              </w:rPr>
-              <w:t>smoke</w:t>
-            </w:r>
-            <w:r>
-              <w:rPr>
-                <w:sz w:val="17"/>
-                <w:lang w:val="ru-RU"/>
-              </w:rPr>
-              <w:t xml:space="preserve"> для </w:t>
-            </w:r>
-            <w:r>
-              <w:rPr>
-                <w:sz w:val="17"/>
-              </w:rPr>
-              <w:t>MySQL</w:t>
-            </w:r>
-            <w:r>
-              <w:rPr>
-                <w:sz w:val="17"/>
-                <w:lang w:val="ru-RU"/>
-              </w:rPr>
-              <w:t xml:space="preserve">, </w:t>
-            </w:r>
-            <w:r>
-              <w:rPr>
-                <w:sz w:val="17"/>
-              </w:rPr>
-              <w:t>MariaDB</w:t>
-            </w:r>
-            <w:r>
-              <w:rPr>
-                <w:sz w:val="17"/>
-                <w:lang w:val="ru-RU"/>
-              </w:rPr>
-              <w:t xml:space="preserve">, </w:t>
-            </w:r>
-            <w:r>
-              <w:rPr>
-                <w:sz w:val="17"/>
-              </w:rPr>
-              <w:t>MS</w:t>
-            </w:r>
-            <w:r>
-              <w:rPr>
-                <w:sz w:val="17"/>
-                <w:lang w:val="ru-RU"/>
-              </w:rPr>
-              <w:t xml:space="preserve"> </w:t>
-            </w:r>
-            <w:r>
-              <w:rPr>
-                <w:sz w:val="17"/>
-              </w:rPr>
-              <w:t>SQL</w:t>
-            </w:r>
-            <w:r>
-              <w:rPr>
-                <w:sz w:val="17"/>
-                <w:lang w:val="ru-RU"/>
-              </w:rPr>
-              <w:t xml:space="preserve"> </w:t>
-            </w:r>
-            <w:r>
-              <w:rPr>
-                <w:sz w:val="17"/>
-              </w:rPr>
-              <w:t>Server</w:t>
-            </w:r>
-            <w:r>
-              <w:rPr>
-                <w:sz w:val="17"/>
-                <w:lang w:val="ru-RU"/>
-              </w:rPr>
-              <w:t xml:space="preserve"> и </w:t>
-            </w:r>
-            <w:r>
-              <w:rPr>
-                <w:sz w:val="17"/>
-              </w:rPr>
-              <w:t>Oracle</w:t>
-            </w:r>
-            <w:r>
-              <w:rPr>
-                <w:sz w:val="17"/>
-                <w:lang w:val="ru-RU"/>
-              </w:rPr>
-              <w:t>.</w:t>
+            <w:r>
+              <w:t>Оставить HSQLDB для быстрого PR-контура, добавить PostgreSQL production-like job на main/release и nightly compatibility regression для MySQL, MariaDB, MS SQL Server и Oracle.</w:t>
             </w:r>
           </w:p>
         </w:tc>

</xml_diff>